<commit_message>
Point setup steps to GitHub and the sample data file
Download from GitHub (Code > Download ZIP), rename LLMClass-main to
LLMClass, and note that main.py runs on data/raw/sample_dirty.txt until
a larger corpus is added. Same change in the project-structure guide.

Co-Authored-By: Claude Opus 5.5 <noreply@anthropic.com>
Claude-Session: https://claude.ai/code/session_01QcwKjrvcPULEZZ9Qz4n5Vo
</commit_message>
<xml_diff>
--- a/ASSIGNMENT.docx
+++ b/ASSIGNMENT.docx
@@ -159,26 +159,66 @@
           <w:szCs w:val="24"/>
           <w:rtl/>
         </w:rPr>
-        <w:t xml:space="preserve"> הורידו את </w:t>
-      </w:r>
-      <w:r>
-        <w:rPr>
-          <w:rFonts w:ascii="Consolas" w:cs="Consolas" w:eastAsia="Consolas" w:hAnsi="Consolas"/>
-          <w:color w:val="0F766E"/>
-          <w:sz w:val="22"/>
-          <w:szCs w:val="22"/>
-          <w:rtl w:val="false"/>
-        </w:rPr>
-        <w:t xml:space="preserve">‎LLMClass.zip‎</w:t>
-      </w:r>
-      <w:r>
-        <w:rPr>
-          <w:rFonts w:ascii="Arial" w:cs="Arial" w:eastAsia="Arial" w:hAnsi="Arial"/>
-          <w:sz w:val="24"/>
-          <w:szCs w:val="24"/>
-          <w:rtl/>
-        </w:rPr>
-        <w:t xml:space="preserve"> מהמקום שבו פורסם (____________________).</w:t>
+        <w:t xml:space="preserve"> היכנסו ל-</w:t>
+      </w:r>
+      <w:r>
+        <w:rPr>
+          <w:rFonts w:ascii="Consolas" w:cs="Consolas" w:eastAsia="Consolas" w:hAnsi="Consolas"/>
+          <w:color w:val="0F766E"/>
+          <w:sz w:val="22"/>
+          <w:szCs w:val="22"/>
+          <w:rtl w:val="false"/>
+        </w:rPr>
+        <w:t xml:space="preserve">‎github.com/leon-anavy/LLMClass‎</w:t>
+      </w:r>
+      <w:r>
+        <w:rPr>
+          <w:rFonts w:ascii="Arial" w:cs="Arial" w:eastAsia="Arial" w:hAnsi="Arial"/>
+          <w:sz w:val="24"/>
+          <w:szCs w:val="24"/>
+          <w:rtl/>
+        </w:rPr>
+        <w:t xml:space="preserve">, לחצו על הכפתור הירוק </w:t>
+      </w:r>
+      <w:r>
+        <w:rPr>
+          <w:rFonts w:ascii="Arial" w:cs="Arial" w:eastAsia="Arial" w:hAnsi="Arial"/>
+          <w:b/>
+          <w:bCs/>
+          <w:sz w:val="24"/>
+          <w:szCs w:val="24"/>
+          <w:rtl/>
+        </w:rPr>
+        <w:t xml:space="preserve">Code</w:t>
+      </w:r>
+      <w:r>
+        <w:rPr>
+          <w:rFonts w:ascii="Arial" w:cs="Arial" w:eastAsia="Arial" w:hAnsi="Arial"/>
+          <w:sz w:val="24"/>
+          <w:szCs w:val="24"/>
+          <w:rtl/>
+        </w:rPr>
+        <w:t xml:space="preserve"> ובחרו </w:t>
+      </w:r>
+      <w:r>
+        <w:rPr>
+          <w:rFonts w:ascii="Arial" w:cs="Arial" w:eastAsia="Arial" w:hAnsi="Arial"/>
+          <w:b/>
+          <w:bCs/>
+          <w:sz w:val="24"/>
+          <w:szCs w:val="24"/>
+          <w:rtl/>
+        </w:rPr>
+        <w:t xml:space="preserve">Download ZIP</w:t>
+      </w:r>
+      <w:r>
+        <w:rPr>
+          <w:rFonts w:ascii="Arial" w:cs="Arial" w:eastAsia="Arial" w:hAnsi="Arial"/>
+          <w:sz w:val="24"/>
+          <w:szCs w:val="24"/>
+          <w:rtl/>
+        </w:rPr>
+        <w:t xml:space="preserve">.</w:t>
       </w:r>
     </w:p>
     <w:p>
@@ -251,16 +291,35 @@
           <w:szCs w:val="24"/>
           <w:rtl/>
         </w:rPr>
-        <w:t xml:space="preserve">בדיקה:</w:t>
-      </w:r>
-      <w:r>
-        <w:rPr>
-          <w:rFonts w:ascii="Arial" w:cs="Arial" w:eastAsia="Arial" w:hAnsi="Arial"/>
-          <w:sz w:val="24"/>
-          <w:szCs w:val="24"/>
-          <w:rtl/>
-        </w:rPr>
-        <w:t xml:space="preserve"> פתחו את התיקייה שנוצרה. אם בתוך </w:t>
+        <w:t xml:space="preserve">שם התיקייה:</w:t>
+      </w:r>
+      <w:r>
+        <w:rPr>
+          <w:rFonts w:ascii="Arial" w:cs="Arial" w:eastAsia="Arial" w:hAnsi="Arial"/>
+          <w:sz w:val="24"/>
+          <w:szCs w:val="24"/>
+          <w:rtl/>
+        </w:rPr>
+        <w:t xml:space="preserve"> התיקייה שנוצרת נקראת </w:t>
+      </w:r>
+      <w:r>
+        <w:rPr>
+          <w:rFonts w:ascii="Consolas" w:cs="Consolas" w:eastAsia="Consolas" w:hAnsi="Consolas"/>
+          <w:color w:val="0F766E"/>
+          <w:sz w:val="22"/>
+          <w:szCs w:val="22"/>
+          <w:rtl w:val="false"/>
+        </w:rPr>
+        <w:t xml:space="preserve">‎LLMClass-main‎</w:t>
+      </w:r>
+      <w:r>
+        <w:rPr>
+          <w:rFonts w:ascii="Arial" w:cs="Arial" w:eastAsia="Arial" w:hAnsi="Arial"/>
+          <w:sz w:val="24"/>
+          <w:szCs w:val="24"/>
+          <w:rtl/>
+        </w:rPr>
+        <w:t xml:space="preserve">. שנו את השם שלה ל-</w:t>
       </w:r>
       <w:r>
         <w:rPr>
@@ -279,26 +338,7 @@
           <w:szCs w:val="24"/>
           <w:rtl/>
         </w:rPr>
-        <w:t xml:space="preserve"> יש עוד תיקייה </w:t>
-      </w:r>
-      <w:r>
-        <w:rPr>
-          <w:rFonts w:ascii="Consolas" w:cs="Consolas" w:eastAsia="Consolas" w:hAnsi="Consolas"/>
-          <w:color w:val="0F766E"/>
-          <w:sz w:val="22"/>
-          <w:szCs w:val="22"/>
-          <w:rtl w:val="false"/>
-        </w:rPr>
-        <w:t xml:space="preserve">‎LLMClass‎</w:t>
-      </w:r>
-      <w:r>
-        <w:rPr>
-          <w:rFonts w:ascii="Arial" w:cs="Arial" w:eastAsia="Arial" w:hAnsi="Arial"/>
-          <w:sz w:val="24"/>
-          <w:szCs w:val="24"/>
-          <w:rtl/>
-        </w:rPr>
-        <w:t xml:space="preserve">, עבדו עם הפנימית: זו שרואים בה ישר את </w:t>
+        <w:t xml:space="preserve">. אם בתוכה יש עוד תיקייה באותו שם, עבדו עם הפנימית: זו שרואים בה ישר את </w:t>
       </w:r>
       <w:r>
         <w:rPr>
@@ -339,35 +379,54 @@
           <w:szCs w:val="24"/>
           <w:rtl/>
         </w:rPr>
-        <w:t xml:space="preserve">הקורפוס:</w:t>
-      </w:r>
-      <w:r>
-        <w:rPr>
-          <w:rFonts w:ascii="Arial" w:cs="Arial" w:eastAsia="Arial" w:hAnsi="Arial"/>
-          <w:sz w:val="24"/>
-          <w:szCs w:val="24"/>
-          <w:rtl/>
-        </w:rPr>
-        <w:t xml:space="preserve"> העתיקו את </w:t>
-      </w:r>
-      <w:r>
-        <w:rPr>
-          <w:rFonts w:ascii="Consolas" w:cs="Consolas" w:eastAsia="Consolas" w:hAnsi="Consolas"/>
-          <w:color w:val="0F766E"/>
-          <w:sz w:val="22"/>
-          <w:szCs w:val="22"/>
-          <w:rtl w:val="false"/>
-        </w:rPr>
-        <w:t xml:space="preserve">‎corpus_ngram_1000_words.txt‎</w:t>
-      </w:r>
-      <w:r>
-        <w:rPr>
-          <w:rFonts w:ascii="Arial" w:cs="Arial" w:eastAsia="Arial" w:hAnsi="Arial"/>
-          <w:sz w:val="24"/>
-          <w:szCs w:val="24"/>
-          <w:rtl/>
-        </w:rPr>
-        <w:t xml:space="preserve"> לתיקייה </w:t>
+        <w:t xml:space="preserve">קובץ הנתונים:</w:t>
+      </w:r>
+      <w:r>
+        <w:rPr>
+          <w:rFonts w:ascii="Arial" w:cs="Arial" w:eastAsia="Arial" w:hAnsi="Arial"/>
+          <w:sz w:val="24"/>
+          <w:szCs w:val="24"/>
+          <w:rtl/>
+        </w:rPr>
+        <w:t xml:space="preserve"> </w:t>
+      </w:r>
+      <w:r>
+        <w:rPr>
+          <w:rFonts w:ascii="Consolas" w:cs="Consolas" w:eastAsia="Consolas" w:hAnsi="Consolas"/>
+          <w:color w:val="0F766E"/>
+          <w:sz w:val="22"/>
+          <w:szCs w:val="22"/>
+          <w:rtl w:val="false"/>
+        </w:rPr>
+        <w:t xml:space="preserve">‎main.py‎</w:t>
+      </w:r>
+      <w:r>
+        <w:rPr>
+          <w:rFonts w:ascii="Arial" w:cs="Arial" w:eastAsia="Arial" w:hAnsi="Arial"/>
+          <w:sz w:val="24"/>
+          <w:szCs w:val="24"/>
+          <w:rtl/>
+        </w:rPr>
+        <w:t xml:space="preserve"> רץ כרגע על קובץ הדוגמה </w:t>
+      </w:r>
+      <w:r>
+        <w:rPr>
+          <w:rFonts w:ascii="Consolas" w:cs="Consolas" w:eastAsia="Consolas" w:hAnsi="Consolas"/>
+          <w:color w:val="0F766E"/>
+          <w:sz w:val="22"/>
+          <w:szCs w:val="22"/>
+          <w:rtl w:val="false"/>
+        </w:rPr>
+        <w:t xml:space="preserve">‎data/raw/sample_dirty.txt‎</w:t>
+      </w:r>
+      <w:r>
+        <w:rPr>
+          <w:rFonts w:ascii="Arial" w:cs="Arial" w:eastAsia="Arial" w:hAnsi="Arial"/>
+          <w:sz w:val="24"/>
+          <w:szCs w:val="24"/>
+          <w:rtl/>
+        </w:rPr>
+        <w:t xml:space="preserve">, אז אין צורך להעתיק כלום. כשתקבלו קורפוס גדול יותר, שימו אותו ב-</w:t>
       </w:r>
       <w:r>
         <w:rPr>
@@ -386,7 +445,45 @@
           <w:szCs w:val="24"/>
           <w:rtl/>
         </w:rPr>
-        <w:t xml:space="preserve"> שבתוך הפרויקט.</w:t>
+        <w:t xml:space="preserve"> ועדכנו את </w:t>
+      </w:r>
+      <w:r>
+        <w:rPr>
+          <w:rFonts w:ascii="Consolas" w:cs="Consolas" w:eastAsia="Consolas" w:hAnsi="Consolas"/>
+          <w:color w:val="0F766E"/>
+          <w:sz w:val="22"/>
+          <w:szCs w:val="22"/>
+          <w:rtl w:val="false"/>
+        </w:rPr>
+        <w:t xml:space="preserve">‎CORPUS_PATH‎</w:t>
+      </w:r>
+      <w:r>
+        <w:rPr>
+          <w:rFonts w:ascii="Arial" w:cs="Arial" w:eastAsia="Arial" w:hAnsi="Arial"/>
+          <w:sz w:val="24"/>
+          <w:szCs w:val="24"/>
+          <w:rtl/>
+        </w:rPr>
+        <w:t xml:space="preserve"> ב-</w:t>
+      </w:r>
+      <w:r>
+        <w:rPr>
+          <w:rFonts w:ascii="Consolas" w:cs="Consolas" w:eastAsia="Consolas" w:hAnsi="Consolas"/>
+          <w:color w:val="0F766E"/>
+          <w:sz w:val="22"/>
+          <w:szCs w:val="22"/>
+          <w:rtl w:val="false"/>
+        </w:rPr>
+        <w:t xml:space="preserve">‎main.py‎</w:t>
+      </w:r>
+      <w:r>
+        <w:rPr>
+          <w:rFonts w:ascii="Arial" w:cs="Arial" w:eastAsia="Arial" w:hAnsi="Arial"/>
+          <w:sz w:val="24"/>
+          <w:szCs w:val="24"/>
+          <w:rtl/>
+        </w:rPr>
+        <w:t xml:space="preserve">.</w:t>
       </w:r>
     </w:p>
     <w:p>

</xml_diff>

<commit_message>
Add 'continue working at home' instructions; clarify main.py on empty starter
Co-Authored-By: Claude Opus 5.5 <noreply@anthropic.com>
Claude-Session: https://claude.ai/code/session_01QcwKjrvcPULEZZ9Qz4n5Vo
</commit_message>
<xml_diff>
--- a/ASSIGNMENT.docx
+++ b/ASSIGNMENT.docx
@@ -773,7 +773,7 @@
           <w:szCs w:val="24"/>
           <w:rtl/>
         </w:rPr>
-        <w:t xml:space="preserve">. בשלד הריק אמור להופיע 0 מתוך 11, וזה תקין. אותו דבר עם </w:t>
+        <w:t xml:space="preserve">. בשלד הריק אמור להופיע 0 מתוך 11, וזה תקין. גם </w:t>
       </w:r>
       <w:r>
         <w:rPr>
@@ -792,7 +792,26 @@
           <w:szCs w:val="24"/>
           <w:rtl/>
         </w:rPr>
-        <w:t xml:space="preserve">.</w:t>
+        <w:t xml:space="preserve"> ייעצר בשלד הריק עם </w:t>
+      </w:r>
+      <w:r>
+        <w:rPr>
+          <w:rFonts w:ascii="Consolas" w:cs="Consolas" w:eastAsia="Consolas" w:hAnsi="Consolas"/>
+          <w:color w:val="0F766E"/>
+          <w:sz w:val="22"/>
+          <w:szCs w:val="22"/>
+          <w:rtl w:val="false"/>
+        </w:rPr>
+        <w:t xml:space="preserve">‎TypeError‎</w:t>
+      </w:r>
+      <w:r>
+        <w:rPr>
+          <w:rFonts w:ascii="Arial" w:cs="Arial" w:eastAsia="Arial" w:hAnsi="Arial"/>
+          <w:sz w:val="24"/>
+          <w:szCs w:val="24"/>
+          <w:rtl/>
+        </w:rPr>
+        <w:t xml:space="preserve">, כי הפונקציות עוד לא מחזירות כלום. זה יסתדר כשתממשו אותן.</w:t>
       </w:r>
     </w:p>
     <w:p>
@@ -868,7 +887,22 @@
           <w:szCs w:val="30"/>
           <w:rtl/>
         </w:rPr>
-        <w:t xml:space="preserve">מה מגישים</w:t>
+        <w:t xml:space="preserve">להמשיך לעבוד בבית</w:t>
+      </w:r>
+    </w:p>
+    <w:p>
+      <w:pPr>
+        <w:bidi/>
+        <w:spacing w:after="120" w:line="300"/>
+      </w:pPr>
+      <w:r>
+        <w:rPr>
+          <w:rFonts w:ascii="Arial" w:cs="Arial" w:eastAsia="Arial" w:hAnsi="Arial"/>
+          <w:sz w:val="24"/>
+          <w:szCs w:val="24"/>
+          <w:rtl/>
+        </w:rPr>
+        <w:t xml:space="preserve">כדי להעביר את הפרויקט בין בית הספר לבית, מכווצים אותו לקובץ zip אחד ושולחים לעצמכם.</w:t>
       </w:r>
     </w:p>
     <w:p>
@@ -890,26 +924,16 @@
           <w:szCs w:val="24"/>
           <w:rtl/>
         </w:rPr>
-        <w:t xml:space="preserve">קובץ אחד בלבד:</w:t>
-      </w:r>
-      <w:r>
-        <w:rPr>
-          <w:rFonts w:ascii="Arial" w:cs="Arial" w:eastAsia="Arial" w:hAnsi="Arial"/>
-          <w:sz w:val="24"/>
-          <w:szCs w:val="24"/>
-          <w:rtl/>
-        </w:rPr>
-        <w:t xml:space="preserve"> </w:t>
-      </w:r>
-      <w:r>
-        <w:rPr>
-          <w:rFonts w:ascii="Consolas" w:cs="Consolas" w:eastAsia="Consolas" w:hAnsi="Consolas"/>
-          <w:color w:val="0F766E"/>
-          <w:sz w:val="22"/>
-          <w:szCs w:val="22"/>
-          <w:rtl w:val="false"/>
-        </w:rPr>
-        <w:t xml:space="preserve">‎llmclass/tokenizer.py‎</w:t>
+        <w:t xml:space="preserve">שומרים וסוגרים</w:t>
+      </w:r>
+      <w:r>
+        <w:rPr>
+          <w:rFonts w:ascii="Arial" w:cs="Arial" w:eastAsia="Arial" w:hAnsi="Arial"/>
+          <w:sz w:val="24"/>
+          <w:szCs w:val="24"/>
+          <w:rtl/>
+        </w:rPr>
+        <w:t xml:space="preserve"> את PyCharm, כדי שכל השינויים ייכתבו לקבצים.</w:t>
       </w:r>
     </w:p>
     <w:p>
@@ -925,22 +949,68 @@
       <w:r>
         <w:rPr>
           <w:rFonts w:ascii="Arial" w:cs="Arial" w:eastAsia="Arial" w:hAnsi="Arial"/>
-          <w:b/>
-          <w:bCs/>
-          <w:sz w:val="24"/>
-          <w:szCs w:val="24"/>
-          <w:rtl/>
-        </w:rPr>
-        <w:t xml:space="preserve">בראש הקובץ:</w:t>
-      </w:r>
-      <w:r>
-        <w:rPr>
-          <w:rFonts w:ascii="Arial" w:cs="Arial" w:eastAsia="Arial" w:hAnsi="Arial"/>
-          <w:sz w:val="24"/>
-          <w:szCs w:val="24"/>
-          <w:rtl/>
-        </w:rPr>
-        <w:t xml:space="preserve"> שם מלא וכיתה, בשורות שכבר מחכות לכם שם</w:t>
+          <w:sz w:val="24"/>
+          <w:szCs w:val="24"/>
+          <w:rtl/>
+        </w:rPr>
+        <w:t xml:space="preserve">נכנסים לתיקייה </w:t>
+      </w:r>
+      <w:r>
+        <w:rPr>
+          <w:rFonts w:ascii="Consolas" w:cs="Consolas" w:eastAsia="Consolas" w:hAnsi="Consolas"/>
+          <w:color w:val="0F766E"/>
+          <w:sz w:val="22"/>
+          <w:szCs w:val="22"/>
+          <w:rtl w:val="false"/>
+        </w:rPr>
+        <w:t xml:space="preserve">‎LLMClass‎</w:t>
+      </w:r>
+      <w:r>
+        <w:rPr>
+          <w:rFonts w:ascii="Arial" w:cs="Arial" w:eastAsia="Arial" w:hAnsi="Arial"/>
+          <w:sz w:val="24"/>
+          <w:szCs w:val="24"/>
+          <w:rtl/>
+        </w:rPr>
+        <w:t xml:space="preserve"> ומסמנים את כל מה שבתוכה, חוץ משתי תיקיות: </w:t>
+      </w:r>
+      <w:r>
+        <w:rPr>
+          <w:rFonts w:ascii="Consolas" w:cs="Consolas" w:eastAsia="Consolas" w:hAnsi="Consolas"/>
+          <w:color w:val="0F766E"/>
+          <w:sz w:val="22"/>
+          <w:szCs w:val="22"/>
+          <w:rtl w:val="false"/>
+        </w:rPr>
+        <w:t xml:space="preserve">‎.venv‎</w:t>
+      </w:r>
+      <w:r>
+        <w:rPr>
+          <w:rFonts w:ascii="Arial" w:cs="Arial" w:eastAsia="Arial" w:hAnsi="Arial"/>
+          <w:sz w:val="24"/>
+          <w:szCs w:val="24"/>
+          <w:rtl/>
+        </w:rPr>
+        <w:t xml:space="preserve"> ו-</w:t>
+      </w:r>
+      <w:r>
+        <w:rPr>
+          <w:rFonts w:ascii="Consolas" w:cs="Consolas" w:eastAsia="Consolas" w:hAnsi="Consolas"/>
+          <w:color w:val="0F766E"/>
+          <w:sz w:val="22"/>
+          <w:szCs w:val="22"/>
+          <w:rtl w:val="false"/>
+        </w:rPr>
+        <w:t xml:space="preserve">‎.idea‎</w:t>
+      </w:r>
+      <w:r>
+        <w:rPr>
+          <w:rFonts w:ascii="Arial" w:cs="Arial" w:eastAsia="Arial" w:hAnsi="Arial"/>
+          <w:sz w:val="24"/>
+          <w:szCs w:val="24"/>
+          <w:rtl/>
+        </w:rPr>
+        <w:t xml:space="preserve">.</w:t>
       </w:r>
     </w:p>
     <w:p>
@@ -962,16 +1032,56 @@
           <w:szCs w:val="24"/>
           <w:rtl/>
         </w:rPr>
-        <w:t xml:space="preserve">מועד הגשה:</w:t>
-      </w:r>
-      <w:r>
-        <w:rPr>
-          <w:rFonts w:ascii="Arial" w:cs="Arial" w:eastAsia="Arial" w:hAnsi="Arial"/>
-          <w:sz w:val="24"/>
-          <w:szCs w:val="24"/>
-          <w:rtl/>
-        </w:rPr>
-        <w:t xml:space="preserve"> יום רביעי</w:t>
+        <w:t xml:space="preserve">מכווצים:</w:t>
+      </w:r>
+      <w:r>
+        <w:rPr>
+          <w:rFonts w:ascii="Arial" w:cs="Arial" w:eastAsia="Arial" w:hAnsi="Arial"/>
+          <w:sz w:val="24"/>
+          <w:szCs w:val="24"/>
+          <w:rtl/>
+        </w:rPr>
+        <w:t xml:space="preserve"> ב-Windows, קליק ימני ובחרו </w:t>
+      </w:r>
+      <w:r>
+        <w:rPr>
+          <w:rFonts w:ascii="Arial" w:cs="Arial" w:eastAsia="Arial" w:hAnsi="Arial"/>
+          <w:b/>
+          <w:bCs/>
+          <w:sz w:val="24"/>
+          <w:szCs w:val="24"/>
+          <w:rtl/>
+        </w:rPr>
+        <w:t xml:space="preserve">Send to &gt; Compressed (zipped) folder</w:t>
+      </w:r>
+      <w:r>
+        <w:rPr>
+          <w:rFonts w:ascii="Arial" w:cs="Arial" w:eastAsia="Arial" w:hAnsi="Arial"/>
+          <w:sz w:val="24"/>
+          <w:szCs w:val="24"/>
+          <w:rtl/>
+        </w:rPr>
+        <w:t xml:space="preserve">. ב-Mac, קליק ימני ובחרו </w:t>
+      </w:r>
+      <w:r>
+        <w:rPr>
+          <w:rFonts w:ascii="Arial" w:cs="Arial" w:eastAsia="Arial" w:hAnsi="Arial"/>
+          <w:b/>
+          <w:bCs/>
+          <w:sz w:val="24"/>
+          <w:szCs w:val="24"/>
+          <w:rtl/>
+        </w:rPr>
+        <w:t xml:space="preserve">Compress</w:t>
+      </w:r>
+      <w:r>
+        <w:rPr>
+          <w:rFonts w:ascii="Arial" w:cs="Arial" w:eastAsia="Arial" w:hAnsi="Arial"/>
+          <w:sz w:val="24"/>
+          <w:szCs w:val="24"/>
+          <w:rtl/>
+        </w:rPr>
+        <w:t xml:space="preserve">.</w:t>
       </w:r>
     </w:p>
     <w:p>
@@ -980,6 +1090,400 @@
         <w:numPr>
           <w:ilvl w:val="0"/>
           <w:numId w:val="3"/>
+        </w:numPr>
+        <w:bidi/>
+        <w:spacing w:after="80" w:line="300"/>
+      </w:pPr>
+      <w:r>
+        <w:rPr>
+          <w:rFonts w:ascii="Arial" w:cs="Arial" w:eastAsia="Arial" w:hAnsi="Arial"/>
+          <w:b/>
+          <w:bCs/>
+          <w:sz w:val="24"/>
+          <w:szCs w:val="24"/>
+          <w:rtl/>
+        </w:rPr>
+        <w:t xml:space="preserve">שם עם תאריך:</w:t>
+      </w:r>
+      <w:r>
+        <w:rPr>
+          <w:rFonts w:ascii="Arial" w:cs="Arial" w:eastAsia="Arial" w:hAnsi="Arial"/>
+          <w:sz w:val="24"/>
+          <w:szCs w:val="24"/>
+          <w:rtl/>
+        </w:rPr>
+        <w:t xml:space="preserve"> קראו לקובץ למשל </w:t>
+      </w:r>
+      <w:r>
+        <w:rPr>
+          <w:rFonts w:ascii="Consolas" w:cs="Consolas" w:eastAsia="Consolas" w:hAnsi="Consolas"/>
+          <w:color w:val="0F766E"/>
+          <w:sz w:val="22"/>
+          <w:szCs w:val="22"/>
+          <w:rtl w:val="false"/>
+        </w:rPr>
+        <w:t xml:space="preserve">‎LLMClass_2026-10-15.zip‎</w:t>
+      </w:r>
+      <w:r>
+        <w:rPr>
+          <w:rFonts w:ascii="Arial" w:cs="Arial" w:eastAsia="Arial" w:hAnsi="Arial"/>
+          <w:sz w:val="24"/>
+          <w:szCs w:val="24"/>
+          <w:rtl/>
+        </w:rPr>
+        <w:t xml:space="preserve">, כדי לדעת איזה עותק הכי חדש.</w:t>
+      </w:r>
+    </w:p>
+    <w:p>
+      <w:pPr>
+        <w:pStyle w:val="ListParagraph"/>
+        <w:numPr>
+          <w:ilvl w:val="0"/>
+          <w:numId w:val="3"/>
+        </w:numPr>
+        <w:bidi/>
+        <w:spacing w:after="80" w:line="300"/>
+      </w:pPr>
+      <w:r>
+        <w:rPr>
+          <w:rFonts w:ascii="Arial" w:cs="Arial" w:eastAsia="Arial" w:hAnsi="Arial"/>
+          <w:b/>
+          <w:bCs/>
+          <w:sz w:val="24"/>
+          <w:szCs w:val="24"/>
+          <w:rtl/>
+        </w:rPr>
+        <w:t xml:space="preserve">שולחים לעצמכם:</w:t>
+      </w:r>
+      <w:r>
+        <w:rPr>
+          <w:rFonts w:ascii="Arial" w:cs="Arial" w:eastAsia="Arial" w:hAnsi="Arial"/>
+          <w:sz w:val="24"/>
+          <w:szCs w:val="24"/>
+          <w:rtl/>
+        </w:rPr>
+        <w:t xml:space="preserve"> מעלים ל-Google Drive דרך </w:t>
+      </w:r>
+      <w:r>
+        <w:rPr>
+          <w:rFonts w:ascii="Arial" w:cs="Arial" w:eastAsia="Arial" w:hAnsi="Arial"/>
+          <w:b/>
+          <w:bCs/>
+          <w:sz w:val="24"/>
+          <w:szCs w:val="24"/>
+          <w:rtl/>
+        </w:rPr>
+        <w:t xml:space="preserve">New &gt; File upload</w:t>
+      </w:r>
+      <w:r>
+        <w:rPr>
+          <w:rFonts w:ascii="Arial" w:cs="Arial" w:eastAsia="Arial" w:hAnsi="Arial"/>
+          <w:sz w:val="24"/>
+          <w:szCs w:val="24"/>
+          <w:rtl/>
+        </w:rPr>
+        <w:t xml:space="preserve">, או מצרפים למייל לעצמכם.</w:t>
+      </w:r>
+    </w:p>
+    <w:p>
+      <w:pPr>
+        <w:pStyle w:val="ListParagraph"/>
+        <w:numPr>
+          <w:ilvl w:val="0"/>
+          <w:numId w:val="3"/>
+        </w:numPr>
+        <w:bidi/>
+        <w:spacing w:after="80" w:line="300"/>
+      </w:pPr>
+      <w:r>
+        <w:rPr>
+          <w:rFonts w:ascii="Arial" w:cs="Arial" w:eastAsia="Arial" w:hAnsi="Arial"/>
+          <w:b/>
+          <w:bCs/>
+          <w:sz w:val="24"/>
+          <w:szCs w:val="24"/>
+          <w:rtl/>
+        </w:rPr>
+        <w:t xml:space="preserve">במחשב השני:</w:t>
+      </w:r>
+      <w:r>
+        <w:rPr>
+          <w:rFonts w:ascii="Arial" w:cs="Arial" w:eastAsia="Arial" w:hAnsi="Arial"/>
+          <w:sz w:val="24"/>
+          <w:szCs w:val="24"/>
+          <w:rtl/>
+        </w:rPr>
+        <w:t xml:space="preserve"> מורידים את ה-zip, מחלצים, משנים את שם התיקייה ל-</w:t>
+      </w:r>
+      <w:r>
+        <w:rPr>
+          <w:rFonts w:ascii="Consolas" w:cs="Consolas" w:eastAsia="Consolas" w:hAnsi="Consolas"/>
+          <w:color w:val="0F766E"/>
+          <w:sz w:val="22"/>
+          <w:szCs w:val="22"/>
+          <w:rtl w:val="false"/>
+        </w:rPr>
+        <w:t xml:space="preserve">‎LLMClass‎</w:t>
+      </w:r>
+      <w:r>
+        <w:rPr>
+          <w:rFonts w:ascii="Arial" w:cs="Arial" w:eastAsia="Arial" w:hAnsi="Arial"/>
+          <w:sz w:val="24"/>
+          <w:szCs w:val="24"/>
+          <w:rtl/>
+        </w:rPr>
+        <w:t xml:space="preserve"> ופותחים ב-PyCharm כמו בשלבים 2–6 למעלה. אם כתוב </w:t>
+      </w:r>
+      <w:r>
+        <w:rPr>
+          <w:rFonts w:ascii="Arial" w:cs="Arial" w:eastAsia="Arial" w:hAnsi="Arial"/>
+          <w:b/>
+          <w:bCs/>
+          <w:sz w:val="24"/>
+          <w:szCs w:val="24"/>
+          <w:rtl/>
+        </w:rPr>
+        <w:t xml:space="preserve">No interpreter</w:t>
+      </w:r>
+      <w:r>
+        <w:rPr>
+          <w:rFonts w:ascii="Arial" w:cs="Arial" w:eastAsia="Arial" w:hAnsi="Arial"/>
+          <w:sz w:val="24"/>
+          <w:szCs w:val="24"/>
+          <w:rtl/>
+        </w:rPr>
+        <w:t xml:space="preserve">, מגדירים חדש.</w:t>
+      </w:r>
+    </w:p>
+    <w:p>
+      <w:pPr>
+        <w:bidi/>
+        <w:spacing w:after="80" w:before="120"/>
+      </w:pPr>
+      <w:r>
+        <w:rPr>
+          <w:rFonts w:ascii="Arial" w:cs="Arial" w:eastAsia="Arial" w:hAnsi="Arial"/>
+          <w:b/>
+          <w:bCs/>
+          <w:sz w:val="24"/>
+          <w:szCs w:val="24"/>
+          <w:rtl/>
+        </w:rPr>
+        <w:t xml:space="preserve">למה בלי </w:t>
+      </w:r>
+      <w:r>
+        <w:rPr>
+          <w:rFonts w:ascii="Consolas" w:cs="Consolas" w:eastAsia="Consolas" w:hAnsi="Consolas"/>
+          <w:b/>
+          <w:bCs/>
+          <w:color w:val="0F766E"/>
+          <w:sz w:val="22"/>
+          <w:szCs w:val="22"/>
+          <w:rtl w:val="false"/>
+        </w:rPr>
+        <w:t xml:space="preserve">‎.venv‎</w:t>
+      </w:r>
+      <w:r>
+        <w:rPr>
+          <w:rFonts w:ascii="Arial" w:cs="Arial" w:eastAsia="Arial" w:hAnsi="Arial"/>
+          <w:b/>
+          <w:bCs/>
+          <w:sz w:val="24"/>
+          <w:szCs w:val="24"/>
+          <w:rtl/>
+        </w:rPr>
+        <w:t xml:space="preserve">?</w:t>
+      </w:r>
+      <w:r>
+        <w:rPr>
+          <w:rFonts w:ascii="Arial" w:cs="Arial" w:eastAsia="Arial" w:hAnsi="Arial"/>
+          <w:sz w:val="24"/>
+          <w:szCs w:val="24"/>
+          <w:rtl/>
+        </w:rPr>
+        <w:t xml:space="preserve"> זו התיקייה שבה PyCharm שומר את הפייתון של הפרויקט. היא כבדה, שייכת רק למחשב שבו נוצרה, ויש בה קבצי הפעלה שבגללם Gmail חוסם את המייל.</w:t>
+      </w:r>
+    </w:p>
+    <w:p>
+      <w:pPr>
+        <w:shd w:fill="FEF3C7" w:color="auto" w:val="clear"/>
+        <w:bidi/>
+        <w:spacing w:after="160" w:before="120"/>
+      </w:pPr>
+      <w:r>
+        <w:rPr>
+          <w:rFonts w:ascii="Arial" w:cs="Arial" w:eastAsia="Arial" w:hAnsi="Arial"/>
+          <w:b/>
+          <w:bCs/>
+          <w:color w:val="92400E"/>
+          <w:sz w:val="24"/>
+          <w:szCs w:val="24"/>
+          <w:rtl/>
+        </w:rPr>
+        <w:t xml:space="preserve">עובדים תמיד על העותק החדש ביותר.</w:t>
+      </w:r>
+      <w:r>
+        <w:rPr>
+          <w:rFonts w:ascii="Arial" w:cs="Arial" w:eastAsia="Arial" w:hAnsi="Arial"/>
+          <w:color w:val="92400E"/>
+          <w:sz w:val="24"/>
+          <w:szCs w:val="24"/>
+          <w:rtl/>
+        </w:rPr>
+        <w:t xml:space="preserve"> בסוף כל עבודה מכווצים ושולחים שוב, ומוחקים עותקים ישנים מהמחשב. שתי תיקיות </w:t>
+      </w:r>
+      <w:r>
+        <w:rPr>
+          <w:rFonts w:ascii="Consolas" w:cs="Consolas" w:eastAsia="Consolas" w:hAnsi="Consolas"/>
+          <w:color w:val="0F766E"/>
+          <w:sz w:val="22"/>
+          <w:szCs w:val="22"/>
+          <w:rtl w:val="false"/>
+        </w:rPr>
+        <w:t xml:space="preserve">‎LLMClass‎</w:t>
+      </w:r>
+      <w:r>
+        <w:rPr>
+          <w:rFonts w:ascii="Arial" w:cs="Arial" w:eastAsia="Arial" w:hAnsi="Arial"/>
+          <w:color w:val="92400E"/>
+          <w:sz w:val="24"/>
+          <w:szCs w:val="24"/>
+          <w:rtl/>
+        </w:rPr>
+        <w:t xml:space="preserve"> על אותו מחשב הן הדרך הכי מהירה לאבד עבודה.</w:t>
+      </w:r>
+    </w:p>
+    <w:p>
+      <w:pPr>
+        <w:pStyle w:val="Heading1"/>
+        <w:pBdr>
+          <w:bottom w:val="single" w:color="D9DED8" w:sz="6" w:space="4"/>
+        </w:pBdr>
+        <w:bidi/>
+        <w:spacing w:after="120" w:before="320"/>
+      </w:pPr>
+      <w:r>
+        <w:rPr>
+          <w:rFonts w:ascii="Arial" w:cs="Arial" w:eastAsia="Arial" w:hAnsi="Arial"/>
+          <w:b/>
+          <w:bCs/>
+          <w:color w:val="0F766E"/>
+          <w:sz w:val="30"/>
+          <w:szCs w:val="30"/>
+          <w:rtl/>
+        </w:rPr>
+        <w:t xml:space="preserve">מה מגישים</w:t>
+      </w:r>
+    </w:p>
+    <w:p>
+      <w:pPr>
+        <w:pStyle w:val="ListParagraph"/>
+        <w:numPr>
+          <w:ilvl w:val="0"/>
+          <w:numId w:val="4"/>
+        </w:numPr>
+        <w:bidi/>
+        <w:spacing w:after="80" w:line="300"/>
+      </w:pPr>
+      <w:r>
+        <w:rPr>
+          <w:rFonts w:ascii="Arial" w:cs="Arial" w:eastAsia="Arial" w:hAnsi="Arial"/>
+          <w:b/>
+          <w:bCs/>
+          <w:sz w:val="24"/>
+          <w:szCs w:val="24"/>
+          <w:rtl/>
+        </w:rPr>
+        <w:t xml:space="preserve">קובץ אחד בלבד:</w:t>
+      </w:r>
+      <w:r>
+        <w:rPr>
+          <w:rFonts w:ascii="Arial" w:cs="Arial" w:eastAsia="Arial" w:hAnsi="Arial"/>
+          <w:sz w:val="24"/>
+          <w:szCs w:val="24"/>
+          <w:rtl/>
+        </w:rPr>
+        <w:t xml:space="preserve"> </w:t>
+      </w:r>
+      <w:r>
+        <w:rPr>
+          <w:rFonts w:ascii="Consolas" w:cs="Consolas" w:eastAsia="Consolas" w:hAnsi="Consolas"/>
+          <w:color w:val="0F766E"/>
+          <w:sz w:val="22"/>
+          <w:szCs w:val="22"/>
+          <w:rtl w:val="false"/>
+        </w:rPr>
+        <w:t xml:space="preserve">‎llmclass/tokenizer.py‎</w:t>
+      </w:r>
+    </w:p>
+    <w:p>
+      <w:pPr>
+        <w:pStyle w:val="ListParagraph"/>
+        <w:numPr>
+          <w:ilvl w:val="0"/>
+          <w:numId w:val="4"/>
+        </w:numPr>
+        <w:bidi/>
+        <w:spacing w:after="80" w:line="300"/>
+      </w:pPr>
+      <w:r>
+        <w:rPr>
+          <w:rFonts w:ascii="Arial" w:cs="Arial" w:eastAsia="Arial" w:hAnsi="Arial"/>
+          <w:b/>
+          <w:bCs/>
+          <w:sz w:val="24"/>
+          <w:szCs w:val="24"/>
+          <w:rtl/>
+        </w:rPr>
+        <w:t xml:space="preserve">בראש הקובץ:</w:t>
+      </w:r>
+      <w:r>
+        <w:rPr>
+          <w:rFonts w:ascii="Arial" w:cs="Arial" w:eastAsia="Arial" w:hAnsi="Arial"/>
+          <w:sz w:val="24"/>
+          <w:szCs w:val="24"/>
+          <w:rtl/>
+        </w:rPr>
+        <w:t xml:space="preserve"> שם מלא וכיתה, בשורות שכבר מחכות לכם שם</w:t>
+      </w:r>
+    </w:p>
+    <w:p>
+      <w:pPr>
+        <w:pStyle w:val="ListParagraph"/>
+        <w:numPr>
+          <w:ilvl w:val="0"/>
+          <w:numId w:val="4"/>
+        </w:numPr>
+        <w:bidi/>
+        <w:spacing w:after="80" w:line="300"/>
+      </w:pPr>
+      <w:r>
+        <w:rPr>
+          <w:rFonts w:ascii="Arial" w:cs="Arial" w:eastAsia="Arial" w:hAnsi="Arial"/>
+          <w:b/>
+          <w:bCs/>
+          <w:sz w:val="24"/>
+          <w:szCs w:val="24"/>
+          <w:rtl/>
+        </w:rPr>
+        <w:t xml:space="preserve">מועד הגשה:</w:t>
+      </w:r>
+      <w:r>
+        <w:rPr>
+          <w:rFonts w:ascii="Arial" w:cs="Arial" w:eastAsia="Arial" w:hAnsi="Arial"/>
+          <w:sz w:val="24"/>
+          <w:szCs w:val="24"/>
+          <w:rtl/>
+        </w:rPr>
+        <w:t xml:space="preserve"> יום רביעי</w:t>
+      </w:r>
+    </w:p>
+    <w:p>
+      <w:pPr>
+        <w:pStyle w:val="ListParagraph"/>
+        <w:numPr>
+          <w:ilvl w:val="0"/>
+          <w:numId w:val="4"/>
         </w:numPr>
         <w:bidi/>
         <w:spacing w:after="80" w:line="300"/>
@@ -2516,7 +3020,7 @@
         <w:pStyle w:val="ListParagraph"/>
         <w:numPr>
           <w:ilvl w:val="0"/>
-          <w:numId w:val="4"/>
+          <w:numId w:val="5"/>
         </w:numPr>
         <w:bidi/>
         <w:spacing w:after="80" w:line="300"/>
@@ -2597,6 +3101,532 @@
           <w:rtl/>
         </w:rPr>
         <w:t xml:space="preserve">). קובץ הבדיקה מסתמך עליהם.</w:t>
+      </w:r>
+    </w:p>
+    <w:p>
+      <w:pPr>
+        <w:pStyle w:val="ListParagraph"/>
+        <w:numPr>
+          <w:ilvl w:val="0"/>
+          <w:numId w:val="5"/>
+        </w:numPr>
+        <w:bidi/>
+        <w:spacing w:after="80" w:line="300"/>
+      </w:pPr>
+      <w:r>
+        <w:rPr>
+          <w:rFonts w:ascii="Arial" w:cs="Arial" w:eastAsia="Arial" w:hAnsi="Arial"/>
+          <w:b/>
+          <w:bCs/>
+          <w:sz w:val="24"/>
+          <w:szCs w:val="24"/>
+          <w:rtl/>
+        </w:rPr>
+        <w:t xml:space="preserve">רק מה שלמדנו:</w:t>
+      </w:r>
+      <w:r>
+        <w:rPr>
+          <w:rFonts w:ascii="Arial" w:cs="Arial" w:eastAsia="Arial" w:hAnsi="Arial"/>
+          <w:sz w:val="24"/>
+          <w:szCs w:val="24"/>
+          <w:rtl/>
+        </w:rPr>
+        <w:t xml:space="preserve"> </w:t>
+      </w:r>
+      <w:r>
+        <w:rPr>
+          <w:rFonts w:ascii="Consolas" w:cs="Consolas" w:eastAsia="Consolas" w:hAnsi="Consolas"/>
+          <w:color w:val="0F766E"/>
+          <w:sz w:val="22"/>
+          <w:szCs w:val="22"/>
+          <w:rtl w:val="false"/>
+        </w:rPr>
+        <w:t xml:space="preserve">‎open‎</w:t>
+      </w:r>
+      <w:r>
+        <w:rPr>
+          <w:rFonts w:ascii="Arial" w:cs="Arial" w:eastAsia="Arial" w:hAnsi="Arial"/>
+          <w:sz w:val="24"/>
+          <w:szCs w:val="24"/>
+          <w:rtl/>
+        </w:rPr>
+        <w:t xml:space="preserve"> עם </w:t>
+      </w:r>
+      <w:r>
+        <w:rPr>
+          <w:rFonts w:ascii="Consolas" w:cs="Consolas" w:eastAsia="Consolas" w:hAnsi="Consolas"/>
+          <w:color w:val="0F766E"/>
+          <w:sz w:val="22"/>
+          <w:szCs w:val="22"/>
+          <w:rtl w:val="false"/>
+        </w:rPr>
+        <w:t xml:space="preserve">‎with‎</w:t>
+      </w:r>
+      <w:r>
+        <w:rPr>
+          <w:rFonts w:ascii="Arial" w:cs="Arial" w:eastAsia="Arial" w:hAnsi="Arial"/>
+          <w:sz w:val="24"/>
+          <w:szCs w:val="24"/>
+          <w:rtl/>
+        </w:rPr>
+        <w:t xml:space="preserve">, </w:t>
+      </w:r>
+      <w:r>
+        <w:rPr>
+          <w:rFonts w:ascii="Consolas" w:cs="Consolas" w:eastAsia="Consolas" w:hAnsi="Consolas"/>
+          <w:color w:val="0F766E"/>
+          <w:sz w:val="22"/>
+          <w:szCs w:val="22"/>
+          <w:rtl w:val="false"/>
+        </w:rPr>
+        <w:t xml:space="preserve">‎read‎</w:t>
+      </w:r>
+      <w:r>
+        <w:rPr>
+          <w:rFonts w:ascii="Arial" w:cs="Arial" w:eastAsia="Arial" w:hAnsi="Arial"/>
+          <w:sz w:val="24"/>
+          <w:szCs w:val="24"/>
+          <w:rtl/>
+        </w:rPr>
+        <w:t xml:space="preserve">, </w:t>
+      </w:r>
+      <w:r>
+        <w:rPr>
+          <w:rFonts w:ascii="Consolas" w:cs="Consolas" w:eastAsia="Consolas" w:hAnsi="Consolas"/>
+          <w:color w:val="0F766E"/>
+          <w:sz w:val="22"/>
+          <w:szCs w:val="22"/>
+          <w:rtl w:val="false"/>
+        </w:rPr>
+        <w:t xml:space="preserve">‎write‎</w:t>
+      </w:r>
+      <w:r>
+        <w:rPr>
+          <w:rFonts w:ascii="Arial" w:cs="Arial" w:eastAsia="Arial" w:hAnsi="Arial"/>
+          <w:sz w:val="24"/>
+          <w:szCs w:val="24"/>
+          <w:rtl/>
+        </w:rPr>
+        <w:t xml:space="preserve">, </w:t>
+      </w:r>
+      <w:r>
+        <w:rPr>
+          <w:rFonts w:ascii="Consolas" w:cs="Consolas" w:eastAsia="Consolas" w:hAnsi="Consolas"/>
+          <w:color w:val="0F766E"/>
+          <w:sz w:val="22"/>
+          <w:szCs w:val="22"/>
+          <w:rtl w:val="false"/>
+        </w:rPr>
+        <w:t xml:space="preserve">‎replace‎</w:t>
+      </w:r>
+      <w:r>
+        <w:rPr>
+          <w:rFonts w:ascii="Arial" w:cs="Arial" w:eastAsia="Arial" w:hAnsi="Arial"/>
+          <w:sz w:val="24"/>
+          <w:szCs w:val="24"/>
+          <w:rtl/>
+        </w:rPr>
+        <w:t xml:space="preserve">, </w:t>
+      </w:r>
+      <w:r>
+        <w:rPr>
+          <w:rFonts w:ascii="Consolas" w:cs="Consolas" w:eastAsia="Consolas" w:hAnsi="Consolas"/>
+          <w:color w:val="0F766E"/>
+          <w:sz w:val="22"/>
+          <w:szCs w:val="22"/>
+          <w:rtl w:val="false"/>
+        </w:rPr>
+        <w:t xml:space="preserve">‎split‎</w:t>
+      </w:r>
+      <w:r>
+        <w:rPr>
+          <w:rFonts w:ascii="Arial" w:cs="Arial" w:eastAsia="Arial" w:hAnsi="Arial"/>
+          <w:sz w:val="24"/>
+          <w:szCs w:val="24"/>
+          <w:rtl/>
+        </w:rPr>
+        <w:t xml:space="preserve">, </w:t>
+      </w:r>
+      <w:r>
+        <w:rPr>
+          <w:rFonts w:ascii="Consolas" w:cs="Consolas" w:eastAsia="Consolas" w:hAnsi="Consolas"/>
+          <w:color w:val="0F766E"/>
+          <w:sz w:val="22"/>
+          <w:szCs w:val="22"/>
+          <w:rtl w:val="false"/>
+        </w:rPr>
+        <w:t xml:space="preserve">‎join‎</w:t>
+      </w:r>
+      <w:r>
+        <w:rPr>
+          <w:rFonts w:ascii="Arial" w:cs="Arial" w:eastAsia="Arial" w:hAnsi="Arial"/>
+          <w:sz w:val="24"/>
+          <w:szCs w:val="24"/>
+          <w:rtl/>
+        </w:rPr>
+        <w:t xml:space="preserve">, לולאת </w:t>
+      </w:r>
+      <w:r>
+        <w:rPr>
+          <w:rFonts w:ascii="Consolas" w:cs="Consolas" w:eastAsia="Consolas" w:hAnsi="Consolas"/>
+          <w:color w:val="0F766E"/>
+          <w:sz w:val="22"/>
+          <w:szCs w:val="22"/>
+          <w:rtl w:val="false"/>
+        </w:rPr>
+        <w:t xml:space="preserve">‎for‎</w:t>
+      </w:r>
+      <w:r>
+        <w:rPr>
+          <w:rFonts w:ascii="Arial" w:cs="Arial" w:eastAsia="Arial" w:hAnsi="Arial"/>
+          <w:sz w:val="24"/>
+          <w:szCs w:val="24"/>
+          <w:rtl/>
+        </w:rPr>
+        <w:t xml:space="preserve">, </w:t>
+      </w:r>
+      <w:r>
+        <w:rPr>
+          <w:rFonts w:ascii="Consolas" w:cs="Consolas" w:eastAsia="Consolas" w:hAnsi="Consolas"/>
+          <w:color w:val="0F766E"/>
+          <w:sz w:val="22"/>
+          <w:szCs w:val="22"/>
+          <w:rtl w:val="false"/>
+        </w:rPr>
+        <w:t xml:space="preserve">‎return‎</w:t>
+      </w:r>
+      <w:r>
+        <w:rPr>
+          <w:rFonts w:ascii="Arial" w:cs="Arial" w:eastAsia="Arial" w:hAnsi="Arial"/>
+          <w:sz w:val="24"/>
+          <w:szCs w:val="24"/>
+          <w:rtl/>
+        </w:rPr>
+        <w:t xml:space="preserve">. בלי ספריות חיצוניות ובלי קוד שאתם לא יכולים להסביר.</w:t>
+      </w:r>
+    </w:p>
+    <w:p>
+      <w:pPr>
+        <w:pStyle w:val="ListParagraph"/>
+        <w:numPr>
+          <w:ilvl w:val="0"/>
+          <w:numId w:val="5"/>
+        </w:numPr>
+        <w:bidi/>
+        <w:spacing w:after="80" w:line="300"/>
+      </w:pPr>
+      <w:r>
+        <w:rPr>
+          <w:rFonts w:ascii="Arial" w:cs="Arial" w:eastAsia="Arial" w:hAnsi="Arial"/>
+          <w:b/>
+          <w:bCs/>
+          <w:sz w:val="24"/>
+          <w:szCs w:val="24"/>
+          <w:rtl/>
+        </w:rPr>
+        <w:t xml:space="preserve">כל פונקציית ניקוי מקבלת מחרוזת ומחזירה מחרוזת.</w:t>
+      </w:r>
+      <w:r>
+        <w:rPr>
+          <w:rFonts w:ascii="Arial" w:cs="Arial" w:eastAsia="Arial" w:hAnsi="Arial"/>
+          <w:sz w:val="24"/>
+          <w:szCs w:val="24"/>
+          <w:rtl/>
+        </w:rPr>
+        <w:t xml:space="preserve"> בלי </w:t>
+      </w:r>
+      <w:r>
+        <w:rPr>
+          <w:rFonts w:ascii="Consolas" w:cs="Consolas" w:eastAsia="Consolas" w:hAnsi="Consolas"/>
+          <w:color w:val="0F766E"/>
+          <w:sz w:val="22"/>
+          <w:szCs w:val="22"/>
+          <w:rtl w:val="false"/>
+        </w:rPr>
+        <w:t xml:space="preserve">‎print‎</w:t>
+      </w:r>
+      <w:r>
+        <w:rPr>
+          <w:rFonts w:ascii="Arial" w:cs="Arial" w:eastAsia="Arial" w:hAnsi="Arial"/>
+          <w:sz w:val="24"/>
+          <w:szCs w:val="24"/>
+          <w:rtl/>
+        </w:rPr>
+        <w:t xml:space="preserve"> בתוך הפונקציות.</w:t>
+      </w:r>
+    </w:p>
+    <w:p>
+      <w:pPr>
+        <w:pStyle w:val="ListParagraph"/>
+        <w:numPr>
+          <w:ilvl w:val="0"/>
+          <w:numId w:val="5"/>
+        </w:numPr>
+        <w:bidi/>
+        <w:spacing w:after="80" w:line="300"/>
+      </w:pPr>
+      <w:r>
+        <w:rPr>
+          <w:rFonts w:ascii="Consolas" w:cs="Consolas" w:eastAsia="Consolas" w:hAnsi="Consolas"/>
+          <w:b/>
+          <w:bCs/>
+          <w:color w:val="0F766E"/>
+          <w:sz w:val="22"/>
+          <w:szCs w:val="22"/>
+          <w:rtl w:val="false"/>
+        </w:rPr>
+        <w:t xml:space="preserve">‎clean‎</w:t>
+      </w:r>
+      <w:r>
+        <w:rPr>
+          <w:rFonts w:ascii="Arial" w:cs="Arial" w:eastAsia="Arial" w:hAnsi="Arial"/>
+          <w:b/>
+          <w:bCs/>
+          <w:sz w:val="24"/>
+          <w:szCs w:val="24"/>
+          <w:rtl/>
+        </w:rPr>
+        <w:t xml:space="preserve"> קוראת לפונקציות הניקוי</w:t>
+      </w:r>
+      <w:r>
+        <w:rPr>
+          <w:rFonts w:ascii="Arial" w:cs="Arial" w:eastAsia="Arial" w:hAnsi="Arial"/>
+          <w:sz w:val="24"/>
+          <w:szCs w:val="24"/>
+          <w:rtl/>
+        </w:rPr>
+        <w:t xml:space="preserve"> ולא מעתיקה את הקוד שלהן. באותו אופן, </w:t>
+      </w:r>
+      <w:r>
+        <w:rPr>
+          <w:rFonts w:ascii="Consolas" w:cs="Consolas" w:eastAsia="Consolas" w:hAnsi="Consolas"/>
+          <w:color w:val="0F766E"/>
+          <w:sz w:val="22"/>
+          <w:szCs w:val="22"/>
+          <w:rtl w:val="false"/>
+        </w:rPr>
+        <w:t xml:space="preserve">‎tokenize‎</w:t>
+      </w:r>
+      <w:r>
+        <w:rPr>
+          <w:rFonts w:ascii="Arial" w:cs="Arial" w:eastAsia="Arial" w:hAnsi="Arial"/>
+          <w:sz w:val="24"/>
+          <w:szCs w:val="24"/>
+          <w:rtl/>
+        </w:rPr>
+        <w:t xml:space="preserve"> קוראת ל-</w:t>
+      </w:r>
+      <w:r>
+        <w:rPr>
+          <w:rFonts w:ascii="Consolas" w:cs="Consolas" w:eastAsia="Consolas" w:hAnsi="Consolas"/>
+          <w:color w:val="0F766E"/>
+          <w:sz w:val="22"/>
+          <w:szCs w:val="22"/>
+          <w:rtl w:val="false"/>
+        </w:rPr>
+        <w:t xml:space="preserve">‎clean‎</w:t>
+      </w:r>
+      <w:r>
+        <w:rPr>
+          <w:rFonts w:ascii="Arial" w:cs="Arial" w:eastAsia="Arial" w:hAnsi="Arial"/>
+          <w:sz w:val="24"/>
+          <w:szCs w:val="24"/>
+          <w:rtl/>
+        </w:rPr>
+        <w:t xml:space="preserve">.</w:t>
+      </w:r>
+    </w:p>
+    <w:p>
+      <w:pPr>
+        <w:pStyle w:val="ListParagraph"/>
+        <w:numPr>
+          <w:ilvl w:val="0"/>
+          <w:numId w:val="5"/>
+        </w:numPr>
+        <w:bidi/>
+        <w:spacing w:after="80" w:line="300"/>
+      </w:pPr>
+      <w:r>
+        <w:rPr>
+          <w:rFonts w:ascii="Arial" w:cs="Arial" w:eastAsia="Arial" w:hAnsi="Arial"/>
+          <w:b/>
+          <w:bCs/>
+          <w:sz w:val="24"/>
+          <w:szCs w:val="24"/>
+          <w:rtl/>
+        </w:rPr>
+        <w:t xml:space="preserve">הערה במילים שלכם</w:t>
+      </w:r>
+      <w:r>
+        <w:rPr>
+          <w:rFonts w:ascii="Arial" w:cs="Arial" w:eastAsia="Arial" w:hAnsi="Arial"/>
+          <w:sz w:val="24"/>
+          <w:szCs w:val="24"/>
+          <w:rtl/>
+        </w:rPr>
+        <w:t xml:space="preserve"> ליד כל שורה בתוך </w:t>
+      </w:r>
+      <w:r>
+        <w:rPr>
+          <w:rFonts w:ascii="Consolas" w:cs="Consolas" w:eastAsia="Consolas" w:hAnsi="Consolas"/>
+          <w:color w:val="0F766E"/>
+          <w:sz w:val="22"/>
+          <w:szCs w:val="22"/>
+          <w:rtl w:val="false"/>
+        </w:rPr>
+        <w:t xml:space="preserve">‎clean‎</w:t>
+      </w:r>
+      <w:r>
+        <w:rPr>
+          <w:rFonts w:ascii="Arial" w:cs="Arial" w:eastAsia="Arial" w:hAnsi="Arial"/>
+          <w:sz w:val="24"/>
+          <w:szCs w:val="24"/>
+          <w:rtl/>
+        </w:rPr>
+        <w:t xml:space="preserve">: מה השלב עושה. הערות שהועתקו מהמצגת לא נחשבות.</w:t>
+      </w:r>
+    </w:p>
+    <w:p>
+      <w:pPr>
+        <w:pStyle w:val="ListParagraph"/>
+        <w:numPr>
+          <w:ilvl w:val="0"/>
+          <w:numId w:val="5"/>
+        </w:numPr>
+        <w:bidi/>
+        <w:spacing w:after="80" w:line="300"/>
+      </w:pPr>
+      <w:r>
+        <w:rPr>
+          <w:rFonts w:ascii="Arial" w:cs="Arial" w:eastAsia="Arial" w:hAnsi="Arial"/>
+          <w:b/>
+          <w:bCs/>
+          <w:sz w:val="24"/>
+          <w:szCs w:val="24"/>
+          <w:rtl/>
+        </w:rPr>
+        <w:t xml:space="preserve">קובץ המקור לא משתנה.</w:t>
+      </w:r>
+      <w:r>
+        <w:rPr>
+          <w:rFonts w:ascii="Arial" w:cs="Arial" w:eastAsia="Arial" w:hAnsi="Arial"/>
+          <w:sz w:val="24"/>
+          <w:szCs w:val="24"/>
+          <w:rtl/>
+        </w:rPr>
+        <w:t xml:space="preserve"> שומרים תמיד לקובץ חדש.</w:t>
+      </w:r>
+    </w:p>
+    <w:p>
+      <w:pPr>
+        <w:pStyle w:val="Heading1"/>
+        <w:pBdr>
+          <w:bottom w:val="single" w:color="D9DED8" w:sz="6" w:space="4"/>
+        </w:pBdr>
+        <w:bidi/>
+        <w:spacing w:after="120" w:before="320"/>
+      </w:pPr>
+      <w:r>
+        <w:rPr>
+          <w:rFonts w:ascii="Arial" w:cs="Arial" w:eastAsia="Arial" w:hAnsi="Arial"/>
+          <w:b/>
+          <w:bCs/>
+          <w:color w:val="0F766E"/>
+          <w:sz w:val="30"/>
+          <w:szCs w:val="30"/>
+          <w:rtl/>
+        </w:rPr>
+        <w:t xml:space="preserve">להסביר כל שורה</w:t>
+      </w:r>
+    </w:p>
+    <w:p>
+      <w:pPr>
+        <w:bidi/>
+        <w:spacing w:after="120" w:line="300"/>
+      </w:pPr>
+      <w:r>
+        <w:rPr>
+          <w:rFonts w:ascii="Arial" w:cs="Arial" w:eastAsia="Arial" w:hAnsi="Arial"/>
+          <w:sz w:val="24"/>
+          <w:szCs w:val="24"/>
+          <w:rtl/>
+        </w:rPr>
+        <w:t xml:space="preserve">אחרי ההגשה תהיה שיחה קצרה, כ-3 דקות. המורה מצביע על שורות בקובץ שלכם, ולכל שורה עונים:</w:t>
+      </w:r>
+    </w:p>
+    <w:p>
+      <w:pPr>
+        <w:pStyle w:val="ListParagraph"/>
+        <w:numPr>
+          <w:ilvl w:val="0"/>
+          <w:numId w:val="6"/>
+        </w:numPr>
+        <w:bidi/>
+        <w:spacing w:after="80" w:line="300"/>
+      </w:pPr>
+      <w:r>
+        <w:rPr>
+          <w:rFonts w:ascii="Arial" w:cs="Arial" w:eastAsia="Arial" w:hAnsi="Arial"/>
+          <w:sz w:val="24"/>
+          <w:szCs w:val="24"/>
+          <w:rtl/>
+        </w:rPr>
+        <w:t xml:space="preserve">מה השורה עושה?</w:t>
+      </w:r>
+    </w:p>
+    <w:p>
+      <w:pPr>
+        <w:pStyle w:val="ListParagraph"/>
+        <w:numPr>
+          <w:ilvl w:val="0"/>
+          <w:numId w:val="6"/>
+        </w:numPr>
+        <w:bidi/>
+        <w:spacing w:after="80" w:line="300"/>
+      </w:pPr>
+      <w:r>
+        <w:rPr>
+          <w:rFonts w:ascii="Arial" w:cs="Arial" w:eastAsia="Arial" w:hAnsi="Arial"/>
+          <w:sz w:val="24"/>
+          <w:szCs w:val="24"/>
+          <w:rtl/>
+        </w:rPr>
+        <w:t xml:space="preserve">מה יהיה במשתנה אחריה? תנו דוגמה על משפט קצר.</w:t>
+      </w:r>
+    </w:p>
+    <w:p>
+      <w:pPr>
+        <w:pStyle w:val="ListParagraph"/>
+        <w:numPr>
+          <w:ilvl w:val="0"/>
+          <w:numId w:val="6"/>
+        </w:numPr>
+        <w:bidi/>
+        <w:spacing w:after="80" w:line="300"/>
+      </w:pPr>
+      <w:r>
+        <w:rPr>
+          <w:rFonts w:ascii="Arial" w:cs="Arial" w:eastAsia="Arial" w:hAnsi="Arial"/>
+          <w:sz w:val="24"/>
+          <w:szCs w:val="24"/>
+          <w:rtl/>
+        </w:rPr>
+        <w:t xml:space="preserve">למה היא נמצאת דווקא במקום הזה?</w:t>
+      </w:r>
+    </w:p>
+    <w:p>
+      <w:pPr>
+        <w:bidi/>
+        <w:spacing w:after="80" w:before="120"/>
+      </w:pPr>
+      <w:r>
+        <w:rPr>
+          <w:rFonts w:ascii="Arial" w:cs="Arial" w:eastAsia="Arial" w:hAnsi="Arial"/>
+          <w:sz w:val="24"/>
+          <w:szCs w:val="24"/>
+          <w:rtl/>
+        </w:rPr>
+        <w:t xml:space="preserve">שאלות לדוגמה שכדאי להתכונן אליהן:</w:t>
       </w:r>
     </w:p>
     <w:p>
@@ -2612,193 +3642,30 @@
       <w:r>
         <w:rPr>
           <w:rFonts w:ascii="Arial" w:cs="Arial" w:eastAsia="Arial" w:hAnsi="Arial"/>
-          <w:b/>
-          <w:bCs/>
-          <w:sz w:val="24"/>
-          <w:szCs w:val="24"/>
-          <w:rtl/>
-        </w:rPr>
-        <w:t xml:space="preserve">רק מה שלמדנו:</w:t>
-      </w:r>
-      <w:r>
-        <w:rPr>
-          <w:rFonts w:ascii="Arial" w:cs="Arial" w:eastAsia="Arial" w:hAnsi="Arial"/>
-          <w:sz w:val="24"/>
-          <w:szCs w:val="24"/>
-          <w:rtl/>
-        </w:rPr>
-        <w:t xml:space="preserve"> </w:t>
-      </w:r>
-      <w:r>
-        <w:rPr>
-          <w:rFonts w:ascii="Consolas" w:cs="Consolas" w:eastAsia="Consolas" w:hAnsi="Consolas"/>
-          <w:color w:val="0F766E"/>
-          <w:sz w:val="22"/>
-          <w:szCs w:val="22"/>
-          <w:rtl w:val="false"/>
-        </w:rPr>
-        <w:t xml:space="preserve">‎open‎</w:t>
-      </w:r>
-      <w:r>
-        <w:rPr>
-          <w:rFonts w:ascii="Arial" w:cs="Arial" w:eastAsia="Arial" w:hAnsi="Arial"/>
-          <w:sz w:val="24"/>
-          <w:szCs w:val="24"/>
-          <w:rtl/>
-        </w:rPr>
-        <w:t xml:space="preserve"> עם </w:t>
-      </w:r>
-      <w:r>
-        <w:rPr>
-          <w:rFonts w:ascii="Consolas" w:cs="Consolas" w:eastAsia="Consolas" w:hAnsi="Consolas"/>
-          <w:color w:val="0F766E"/>
-          <w:sz w:val="22"/>
-          <w:szCs w:val="22"/>
-          <w:rtl w:val="false"/>
-        </w:rPr>
-        <w:t xml:space="preserve">‎with‎</w:t>
-      </w:r>
-      <w:r>
-        <w:rPr>
-          <w:rFonts w:ascii="Arial" w:cs="Arial" w:eastAsia="Arial" w:hAnsi="Arial"/>
-          <w:sz w:val="24"/>
-          <w:szCs w:val="24"/>
-          <w:rtl/>
-        </w:rPr>
-        <w:t xml:space="preserve">, </w:t>
-      </w:r>
-      <w:r>
-        <w:rPr>
-          <w:rFonts w:ascii="Consolas" w:cs="Consolas" w:eastAsia="Consolas" w:hAnsi="Consolas"/>
-          <w:color w:val="0F766E"/>
-          <w:sz w:val="22"/>
-          <w:szCs w:val="22"/>
-          <w:rtl w:val="false"/>
-        </w:rPr>
-        <w:t xml:space="preserve">‎read‎</w:t>
-      </w:r>
-      <w:r>
-        <w:rPr>
-          <w:rFonts w:ascii="Arial" w:cs="Arial" w:eastAsia="Arial" w:hAnsi="Arial"/>
-          <w:sz w:val="24"/>
-          <w:szCs w:val="24"/>
-          <w:rtl/>
-        </w:rPr>
-        <w:t xml:space="preserve">, </w:t>
-      </w:r>
-      <w:r>
-        <w:rPr>
-          <w:rFonts w:ascii="Consolas" w:cs="Consolas" w:eastAsia="Consolas" w:hAnsi="Consolas"/>
-          <w:color w:val="0F766E"/>
-          <w:sz w:val="22"/>
-          <w:szCs w:val="22"/>
-          <w:rtl w:val="false"/>
-        </w:rPr>
-        <w:t xml:space="preserve">‎write‎</w:t>
-      </w:r>
-      <w:r>
-        <w:rPr>
-          <w:rFonts w:ascii="Arial" w:cs="Arial" w:eastAsia="Arial" w:hAnsi="Arial"/>
-          <w:sz w:val="24"/>
-          <w:szCs w:val="24"/>
-          <w:rtl/>
-        </w:rPr>
-        <w:t xml:space="preserve">, </w:t>
-      </w:r>
-      <w:r>
-        <w:rPr>
-          <w:rFonts w:ascii="Consolas" w:cs="Consolas" w:eastAsia="Consolas" w:hAnsi="Consolas"/>
-          <w:color w:val="0F766E"/>
-          <w:sz w:val="22"/>
-          <w:szCs w:val="22"/>
-          <w:rtl w:val="false"/>
-        </w:rPr>
-        <w:t xml:space="preserve">‎replace‎</w:t>
-      </w:r>
-      <w:r>
-        <w:rPr>
-          <w:rFonts w:ascii="Arial" w:cs="Arial" w:eastAsia="Arial" w:hAnsi="Arial"/>
-          <w:sz w:val="24"/>
-          <w:szCs w:val="24"/>
-          <w:rtl/>
-        </w:rPr>
-        <w:t xml:space="preserve">, </w:t>
-      </w:r>
-      <w:r>
-        <w:rPr>
-          <w:rFonts w:ascii="Consolas" w:cs="Consolas" w:eastAsia="Consolas" w:hAnsi="Consolas"/>
-          <w:color w:val="0F766E"/>
-          <w:sz w:val="22"/>
-          <w:szCs w:val="22"/>
-          <w:rtl w:val="false"/>
-        </w:rPr>
-        <w:t xml:space="preserve">‎split‎</w:t>
-      </w:r>
-      <w:r>
-        <w:rPr>
-          <w:rFonts w:ascii="Arial" w:cs="Arial" w:eastAsia="Arial" w:hAnsi="Arial"/>
-          <w:sz w:val="24"/>
-          <w:szCs w:val="24"/>
-          <w:rtl/>
-        </w:rPr>
-        <w:t xml:space="preserve">, </w:t>
-      </w:r>
-      <w:r>
-        <w:rPr>
-          <w:rFonts w:ascii="Consolas" w:cs="Consolas" w:eastAsia="Consolas" w:hAnsi="Consolas"/>
-          <w:color w:val="0F766E"/>
-          <w:sz w:val="22"/>
-          <w:szCs w:val="22"/>
-          <w:rtl w:val="false"/>
-        </w:rPr>
-        <w:t xml:space="preserve">‎join‎</w:t>
-      </w:r>
-      <w:r>
-        <w:rPr>
-          <w:rFonts w:ascii="Arial" w:cs="Arial" w:eastAsia="Arial" w:hAnsi="Arial"/>
-          <w:sz w:val="24"/>
-          <w:szCs w:val="24"/>
-          <w:rtl/>
-        </w:rPr>
-        <w:t xml:space="preserve">, לולאת </w:t>
-      </w:r>
-      <w:r>
-        <w:rPr>
-          <w:rFonts w:ascii="Consolas" w:cs="Consolas" w:eastAsia="Consolas" w:hAnsi="Consolas"/>
-          <w:color w:val="0F766E"/>
-          <w:sz w:val="22"/>
-          <w:szCs w:val="22"/>
-          <w:rtl w:val="false"/>
-        </w:rPr>
-        <w:t xml:space="preserve">‎for‎</w:t>
-      </w:r>
-      <w:r>
-        <w:rPr>
-          <w:rFonts w:ascii="Arial" w:cs="Arial" w:eastAsia="Arial" w:hAnsi="Arial"/>
-          <w:sz w:val="24"/>
-          <w:szCs w:val="24"/>
-          <w:rtl/>
-        </w:rPr>
-        <w:t xml:space="preserve">, </w:t>
-      </w:r>
-      <w:r>
-        <w:rPr>
-          <w:rFonts w:ascii="Consolas" w:cs="Consolas" w:eastAsia="Consolas" w:hAnsi="Consolas"/>
-          <w:color w:val="0F766E"/>
-          <w:sz w:val="22"/>
-          <w:szCs w:val="22"/>
-          <w:rtl w:val="false"/>
-        </w:rPr>
-        <w:t xml:space="preserve">‎return‎</w:t>
-      </w:r>
-      <w:r>
-        <w:rPr>
-          <w:rFonts w:ascii="Arial" w:cs="Arial" w:eastAsia="Arial" w:hAnsi="Arial"/>
-          <w:sz w:val="24"/>
-          <w:szCs w:val="24"/>
-          <w:rtl/>
-        </w:rPr>
-        <w:t xml:space="preserve">. בלי ספריות חיצוניות ובלי קוד שאתם לא יכולים להסביר.</w:t>
+          <w:sz w:val="24"/>
+          <w:szCs w:val="24"/>
+          <w:rtl/>
+        </w:rPr>
+        <w:t xml:space="preserve">למה יש רווח לפני ואחרי </w:t>
+      </w:r>
+      <w:r>
+        <w:rPr>
+          <w:rFonts w:ascii="Consolas" w:cs="Consolas" w:eastAsia="Consolas" w:hAnsi="Consolas"/>
+          <w:color w:val="0F766E"/>
+          <w:sz w:val="22"/>
+          <w:szCs w:val="22"/>
+          <w:rtl w:val="false"/>
+        </w:rPr>
+        <w:t xml:space="preserve">‎&lt;EOS&gt;‎</w:t>
+      </w:r>
+      <w:r>
+        <w:rPr>
+          <w:rFonts w:ascii="Arial" w:cs="Arial" w:eastAsia="Arial" w:hAnsi="Arial"/>
+          <w:sz w:val="24"/>
+          <w:szCs w:val="24"/>
+          <w:rtl/>
+        </w:rPr>
+        <w:t xml:space="preserve">?</w:t>
       </w:r>
     </w:p>
     <w:p>
@@ -2814,41 +3681,11 @@
       <w:r>
         <w:rPr>
           <w:rFonts w:ascii="Arial" w:cs="Arial" w:eastAsia="Arial" w:hAnsi="Arial"/>
-          <w:b/>
-          <w:bCs/>
-          <w:sz w:val="24"/>
-          <w:szCs w:val="24"/>
-          <w:rtl/>
-        </w:rPr>
-        <w:t xml:space="preserve">כל פונקציית ניקוי מקבלת מחרוזת ומחזירה מחרוזת.</w:t>
-      </w:r>
-      <w:r>
-        <w:rPr>
-          <w:rFonts w:ascii="Arial" w:cs="Arial" w:eastAsia="Arial" w:hAnsi="Arial"/>
-          <w:sz w:val="24"/>
-          <w:szCs w:val="24"/>
-          <w:rtl/>
-        </w:rPr>
-        <w:t xml:space="preserve"> בלי </w:t>
-      </w:r>
-      <w:r>
-        <w:rPr>
-          <w:rFonts w:ascii="Consolas" w:cs="Consolas" w:eastAsia="Consolas" w:hAnsi="Consolas"/>
-          <w:color w:val="0F766E"/>
-          <w:sz w:val="22"/>
-          <w:szCs w:val="22"/>
-          <w:rtl w:val="false"/>
-        </w:rPr>
-        <w:t xml:space="preserve">‎print‎</w:t>
-      </w:r>
-      <w:r>
-        <w:rPr>
-          <w:rFonts w:ascii="Arial" w:cs="Arial" w:eastAsia="Arial" w:hAnsi="Arial"/>
-          <w:sz w:val="24"/>
-          <w:szCs w:val="24"/>
-          <w:rtl/>
-        </w:rPr>
-        <w:t xml:space="preserve"> בתוך הפונקציות.</w:t>
+          <w:sz w:val="24"/>
+          <w:szCs w:val="24"/>
+          <w:rtl/>
+        </w:rPr>
+        <w:t xml:space="preserve">למה מקף הופך לרווח ולא נמחק?</w:t>
       </w:r>
     </w:p>
     <w:p>
@@ -2863,73 +3700,50 @@
       </w:pPr>
       <w:r>
         <w:rPr>
-          <w:rFonts w:ascii="Consolas" w:cs="Consolas" w:eastAsia="Consolas" w:hAnsi="Consolas"/>
-          <w:b/>
-          <w:bCs/>
-          <w:color w:val="0F766E"/>
-          <w:sz w:val="22"/>
-          <w:szCs w:val="22"/>
-          <w:rtl w:val="false"/>
-        </w:rPr>
-        <w:t xml:space="preserve">‎clean‎</w:t>
-      </w:r>
-      <w:r>
-        <w:rPr>
-          <w:rFonts w:ascii="Arial" w:cs="Arial" w:eastAsia="Arial" w:hAnsi="Arial"/>
-          <w:b/>
-          <w:bCs/>
-          <w:sz w:val="24"/>
-          <w:szCs w:val="24"/>
-          <w:rtl/>
-        </w:rPr>
-        <w:t xml:space="preserve"> קוראת לפונקציות הניקוי</w:t>
-      </w:r>
-      <w:r>
-        <w:rPr>
-          <w:rFonts w:ascii="Arial" w:cs="Arial" w:eastAsia="Arial" w:hAnsi="Arial"/>
-          <w:sz w:val="24"/>
-          <w:szCs w:val="24"/>
-          <w:rtl/>
-        </w:rPr>
-        <w:t xml:space="preserve"> ולא מעתיקה את הקוד שלהן. באותו אופן, </w:t>
-      </w:r>
-      <w:r>
-        <w:rPr>
-          <w:rFonts w:ascii="Consolas" w:cs="Consolas" w:eastAsia="Consolas" w:hAnsi="Consolas"/>
-          <w:color w:val="0F766E"/>
-          <w:sz w:val="22"/>
-          <w:szCs w:val="22"/>
-          <w:rtl w:val="false"/>
-        </w:rPr>
-        <w:t xml:space="preserve">‎tokenize‎</w:t>
-      </w:r>
-      <w:r>
-        <w:rPr>
-          <w:rFonts w:ascii="Arial" w:cs="Arial" w:eastAsia="Arial" w:hAnsi="Arial"/>
-          <w:sz w:val="24"/>
-          <w:szCs w:val="24"/>
-          <w:rtl/>
-        </w:rPr>
-        <w:t xml:space="preserve"> קוראת ל-</w:t>
-      </w:r>
-      <w:r>
-        <w:rPr>
-          <w:rFonts w:ascii="Consolas" w:cs="Consolas" w:eastAsia="Consolas" w:hAnsi="Consolas"/>
-          <w:color w:val="0F766E"/>
-          <w:sz w:val="22"/>
-          <w:szCs w:val="22"/>
-          <w:rtl w:val="false"/>
-        </w:rPr>
-        <w:t xml:space="preserve">‎clean‎</w:t>
-      </w:r>
-      <w:r>
-        <w:rPr>
-          <w:rFonts w:ascii="Arial" w:cs="Arial" w:eastAsia="Arial" w:hAnsi="Arial"/>
-          <w:sz w:val="24"/>
-          <w:szCs w:val="24"/>
-          <w:rtl/>
-        </w:rPr>
-        <w:t xml:space="preserve">.</w:t>
+          <w:rFonts w:ascii="Arial" w:cs="Arial" w:eastAsia="Arial" w:hAnsi="Arial"/>
+          <w:sz w:val="24"/>
+          <w:szCs w:val="24"/>
+          <w:rtl/>
+        </w:rPr>
+        <w:t xml:space="preserve">למה כותבים </w:t>
+      </w:r>
+      <w:r>
+        <w:rPr>
+          <w:rFonts w:ascii="Consolas" w:cs="Consolas" w:eastAsia="Consolas" w:hAnsi="Consolas"/>
+          <w:color w:val="0F766E"/>
+          <w:sz w:val="22"/>
+          <w:szCs w:val="22"/>
+          <w:rtl w:val="false"/>
+        </w:rPr>
+        <w:t xml:space="preserve">‎text = text.replace(...)‎</w:t>
+      </w:r>
+      <w:r>
+        <w:rPr>
+          <w:rFonts w:ascii="Arial" w:cs="Arial" w:eastAsia="Arial" w:hAnsi="Arial"/>
+          <w:sz w:val="24"/>
+          <w:szCs w:val="24"/>
+          <w:rtl/>
+        </w:rPr>
+        <w:t xml:space="preserve"> ולא רק </w:t>
+      </w:r>
+      <w:r>
+        <w:rPr>
+          <w:rFonts w:ascii="Consolas" w:cs="Consolas" w:eastAsia="Consolas" w:hAnsi="Consolas"/>
+          <w:color w:val="0F766E"/>
+          <w:sz w:val="22"/>
+          <w:szCs w:val="22"/>
+          <w:rtl w:val="false"/>
+        </w:rPr>
+        <w:t xml:space="preserve">‎text.replace(...)‎</w:t>
+      </w:r>
+      <w:r>
+        <w:rPr>
+          <w:rFonts w:ascii="Arial" w:cs="Arial" w:eastAsia="Arial" w:hAnsi="Arial"/>
+          <w:sz w:val="24"/>
+          <w:szCs w:val="24"/>
+          <w:rtl/>
+        </w:rPr>
+        <w:t xml:space="preserve">?</w:t>
       </w:r>
     </w:p>
     <w:p>
@@ -2945,22 +3759,30 @@
       <w:r>
         <w:rPr>
           <w:rFonts w:ascii="Arial" w:cs="Arial" w:eastAsia="Arial" w:hAnsi="Arial"/>
-          <w:b/>
-          <w:bCs/>
-          <w:sz w:val="24"/>
-          <w:szCs w:val="24"/>
-          <w:rtl/>
-        </w:rPr>
-        <w:t xml:space="preserve">הערה במילים שלכם</w:t>
-      </w:r>
-      <w:r>
-        <w:rPr>
-          <w:rFonts w:ascii="Arial" w:cs="Arial" w:eastAsia="Arial" w:hAnsi="Arial"/>
-          <w:sz w:val="24"/>
-          <w:szCs w:val="24"/>
-          <w:rtl/>
-        </w:rPr>
-        <w:t xml:space="preserve"> ליד כל שורה בתוך </w:t>
+          <w:sz w:val="24"/>
+          <w:szCs w:val="24"/>
+          <w:rtl/>
+        </w:rPr>
+        <w:t xml:space="preserve">למה </w:t>
+      </w:r>
+      <w:r>
+        <w:rPr>
+          <w:rFonts w:ascii="Consolas" w:cs="Consolas" w:eastAsia="Consolas" w:hAnsi="Consolas"/>
+          <w:color w:val="0F766E"/>
+          <w:sz w:val="22"/>
+          <w:szCs w:val="22"/>
+          <w:rtl w:val="false"/>
+        </w:rPr>
+        <w:t xml:space="preserve">‎normalize_spaces‎</w:t>
+      </w:r>
+      <w:r>
+        <w:rPr>
+          <w:rFonts w:ascii="Arial" w:cs="Arial" w:eastAsia="Arial" w:hAnsi="Arial"/>
+          <w:sz w:val="24"/>
+          <w:szCs w:val="24"/>
+          <w:rtl/>
+        </w:rPr>
+        <w:t xml:space="preserve"> היא השלב האחרון ב-</w:t>
       </w:r>
       <w:r>
         <w:rPr>
@@ -2979,7 +3801,7 @@
           <w:szCs w:val="24"/>
           <w:rtl/>
         </w:rPr>
-        <w:t xml:space="preserve">: מה השלב עושה. הערות שהועתקו מהמצגת לא נחשבות.</w:t>
+        <w:t xml:space="preserve">?</w:t>
       </w:r>
     </w:p>
     <w:p>
@@ -2995,22 +3817,262 @@
       <w:r>
         <w:rPr>
           <w:rFonts w:ascii="Arial" w:cs="Arial" w:eastAsia="Arial" w:hAnsi="Arial"/>
-          <w:b/>
-          <w:bCs/>
-          <w:sz w:val="24"/>
-          <w:szCs w:val="24"/>
-          <w:rtl/>
-        </w:rPr>
-        <w:t xml:space="preserve">קובץ המקור לא משתנה.</w:t>
-      </w:r>
-      <w:r>
-        <w:rPr>
-          <w:rFonts w:ascii="Arial" w:cs="Arial" w:eastAsia="Arial" w:hAnsi="Arial"/>
-          <w:sz w:val="24"/>
-          <w:szCs w:val="24"/>
-          <w:rtl/>
-        </w:rPr>
-        <w:t xml:space="preserve"> שומרים תמיד לקובץ חדש.</w:t>
+          <w:sz w:val="24"/>
+          <w:szCs w:val="24"/>
+          <w:rtl/>
+        </w:rPr>
+        <w:t xml:space="preserve">מה ההבדל בין </w:t>
+      </w:r>
+      <w:r>
+        <w:rPr>
+          <w:rFonts w:ascii="Consolas" w:cs="Consolas" w:eastAsia="Consolas" w:hAnsi="Consolas"/>
+          <w:color w:val="0F766E"/>
+          <w:sz w:val="22"/>
+          <w:szCs w:val="22"/>
+          <w:rtl w:val="false"/>
+        </w:rPr>
+        <w:t xml:space="preserve">‎split()‎</w:t>
+      </w:r>
+      <w:r>
+        <w:rPr>
+          <w:rFonts w:ascii="Arial" w:cs="Arial" w:eastAsia="Arial" w:hAnsi="Arial"/>
+          <w:sz w:val="24"/>
+          <w:szCs w:val="24"/>
+          <w:rtl/>
+        </w:rPr>
+        <w:t xml:space="preserve"> לבין </w:t>
+      </w:r>
+      <w:r>
+        <w:rPr>
+          <w:rFonts w:ascii="Consolas" w:cs="Consolas" w:eastAsia="Consolas" w:hAnsi="Consolas"/>
+          <w:color w:val="0F766E"/>
+          <w:sz w:val="22"/>
+          <w:szCs w:val="22"/>
+          <w:rtl w:val="false"/>
+        </w:rPr>
+        <w:t xml:space="preserve">‎split(" ")‎</w:t>
+      </w:r>
+      <w:r>
+        <w:rPr>
+          <w:rFonts w:ascii="Arial" w:cs="Arial" w:eastAsia="Arial" w:hAnsi="Arial"/>
+          <w:sz w:val="24"/>
+          <w:szCs w:val="24"/>
+          <w:rtl/>
+        </w:rPr>
+        <w:t xml:space="preserve">?</w:t>
+      </w:r>
+    </w:p>
+    <w:p>
+      <w:pPr>
+        <w:pStyle w:val="ListParagraph"/>
+        <w:numPr>
+          <w:ilvl w:val="0"/>
+          <w:numId w:val="4"/>
+        </w:numPr>
+        <w:bidi/>
+        <w:spacing w:after="80" w:line="300"/>
+      </w:pPr>
+      <w:r>
+        <w:rPr>
+          <w:rFonts w:ascii="Arial" w:cs="Arial" w:eastAsia="Arial" w:hAnsi="Arial"/>
+          <w:sz w:val="24"/>
+          <w:szCs w:val="24"/>
+          <w:rtl/>
+        </w:rPr>
+        <w:t xml:space="preserve">מה היה קורה באנגלית אם </w:t>
+      </w:r>
+      <w:r>
+        <w:rPr>
+          <w:rFonts w:ascii="Consolas" w:cs="Consolas" w:eastAsia="Consolas" w:hAnsi="Consolas"/>
+          <w:color w:val="0F766E"/>
+          <w:sz w:val="22"/>
+          <w:szCs w:val="22"/>
+          <w:rtl w:val="false"/>
+        </w:rPr>
+        <w:t xml:space="preserve">‎lower()‎</w:t>
+      </w:r>
+      <w:r>
+        <w:rPr>
+          <w:rFonts w:ascii="Arial" w:cs="Arial" w:eastAsia="Arial" w:hAnsi="Arial"/>
+          <w:sz w:val="24"/>
+          <w:szCs w:val="24"/>
+          <w:rtl/>
+        </w:rPr>
+        <w:t xml:space="preserve"> היה רץ אחרי </w:t>
+      </w:r>
+      <w:r>
+        <w:rPr>
+          <w:rFonts w:ascii="Consolas" w:cs="Consolas" w:eastAsia="Consolas" w:hAnsi="Consolas"/>
+          <w:color w:val="0F766E"/>
+          <w:sz w:val="22"/>
+          <w:szCs w:val="22"/>
+          <w:rtl w:val="false"/>
+        </w:rPr>
+        <w:t xml:space="preserve">‎mark_sentences‎</w:t>
+      </w:r>
+      <w:r>
+        <w:rPr>
+          <w:rFonts w:ascii="Arial" w:cs="Arial" w:eastAsia="Arial" w:hAnsi="Arial"/>
+          <w:sz w:val="24"/>
+          <w:szCs w:val="24"/>
+          <w:rtl/>
+        </w:rPr>
+        <w:t xml:space="preserve">?</w:t>
+      </w:r>
+    </w:p>
+    <w:p>
+      <w:pPr>
+        <w:pStyle w:val="ListParagraph"/>
+        <w:numPr>
+          <w:ilvl w:val="0"/>
+          <w:numId w:val="4"/>
+        </w:numPr>
+        <w:bidi/>
+        <w:spacing w:after="80" w:line="300"/>
+      </w:pPr>
+      <w:r>
+        <w:rPr>
+          <w:rFonts w:ascii="Arial" w:cs="Arial" w:eastAsia="Arial" w:hAnsi="Arial"/>
+          <w:sz w:val="24"/>
+          <w:szCs w:val="24"/>
+          <w:rtl/>
+        </w:rPr>
+        <w:t xml:space="preserve">מה </w:t>
+      </w:r>
+      <w:r>
+        <w:rPr>
+          <w:rFonts w:ascii="Consolas" w:cs="Consolas" w:eastAsia="Consolas" w:hAnsi="Consolas"/>
+          <w:color w:val="0F766E"/>
+          <w:sz w:val="22"/>
+          <w:szCs w:val="22"/>
+          <w:rtl w:val="false"/>
+        </w:rPr>
+        <w:t xml:space="preserve">‎encoding="utf-8"‎</w:t>
+      </w:r>
+      <w:r>
+        <w:rPr>
+          <w:rFonts w:ascii="Arial" w:cs="Arial" w:eastAsia="Arial" w:hAnsi="Arial"/>
+          <w:sz w:val="24"/>
+          <w:szCs w:val="24"/>
+          <w:rtl/>
+        </w:rPr>
+        <w:t xml:space="preserve"> עושה, ומה קורה בלעדיו?</w:t>
+      </w:r>
+    </w:p>
+    <w:p>
+      <w:pPr>
+        <w:pStyle w:val="ListParagraph"/>
+        <w:numPr>
+          <w:ilvl w:val="0"/>
+          <w:numId w:val="4"/>
+        </w:numPr>
+        <w:bidi/>
+        <w:spacing w:after="80" w:line="300"/>
+      </w:pPr>
+      <w:r>
+        <w:rPr>
+          <w:rFonts w:ascii="Arial" w:cs="Arial" w:eastAsia="Arial" w:hAnsi="Arial"/>
+          <w:sz w:val="24"/>
+          <w:szCs w:val="24"/>
+          <w:rtl/>
+        </w:rPr>
+        <w:t xml:space="preserve">מה עושה </w:t>
+      </w:r>
+      <w:r>
+        <w:rPr>
+          <w:rFonts w:ascii="Consolas" w:cs="Consolas" w:eastAsia="Consolas" w:hAnsi="Consolas"/>
+          <w:color w:val="0F766E"/>
+          <w:sz w:val="22"/>
+          <w:szCs w:val="22"/>
+          <w:rtl w:val="false"/>
+        </w:rPr>
+        <w:t xml:space="preserve">‎with‎</w:t>
+      </w:r>
+      <w:r>
+        <w:rPr>
+          <w:rFonts w:ascii="Arial" w:cs="Arial" w:eastAsia="Arial" w:hAnsi="Arial"/>
+          <w:sz w:val="24"/>
+          <w:szCs w:val="24"/>
+          <w:rtl/>
+        </w:rPr>
+        <w:t xml:space="preserve">, ומה ההבדל בין </w:t>
+      </w:r>
+      <w:r>
+        <w:rPr>
+          <w:rFonts w:ascii="Consolas" w:cs="Consolas" w:eastAsia="Consolas" w:hAnsi="Consolas"/>
+          <w:color w:val="0F766E"/>
+          <w:sz w:val="22"/>
+          <w:szCs w:val="22"/>
+          <w:rtl w:val="false"/>
+        </w:rPr>
+        <w:t xml:space="preserve">‎"r"‎</w:t>
+      </w:r>
+      <w:r>
+        <w:rPr>
+          <w:rFonts w:ascii="Arial" w:cs="Arial" w:eastAsia="Arial" w:hAnsi="Arial"/>
+          <w:sz w:val="24"/>
+          <w:szCs w:val="24"/>
+          <w:rtl/>
+        </w:rPr>
+        <w:t xml:space="preserve"> ל-</w:t>
+      </w:r>
+      <w:r>
+        <w:rPr>
+          <w:rFonts w:ascii="Consolas" w:cs="Consolas" w:eastAsia="Consolas" w:hAnsi="Consolas"/>
+          <w:color w:val="0F766E"/>
+          <w:sz w:val="22"/>
+          <w:szCs w:val="22"/>
+          <w:rtl w:val="false"/>
+        </w:rPr>
+        <w:t xml:space="preserve">‎"w"‎</w:t>
+      </w:r>
+      <w:r>
+        <w:rPr>
+          <w:rFonts w:ascii="Arial" w:cs="Arial" w:eastAsia="Arial" w:hAnsi="Arial"/>
+          <w:sz w:val="24"/>
+          <w:szCs w:val="24"/>
+          <w:rtl/>
+        </w:rPr>
+        <w:t xml:space="preserve">?</w:t>
+      </w:r>
+    </w:p>
+    <w:p>
+      <w:pPr>
+        <w:pStyle w:val="ListParagraph"/>
+        <w:numPr>
+          <w:ilvl w:val="0"/>
+          <w:numId w:val="4"/>
+        </w:numPr>
+        <w:bidi/>
+        <w:spacing w:after="80" w:line="300"/>
+      </w:pPr>
+      <w:r>
+        <w:rPr>
+          <w:rFonts w:ascii="Arial" w:cs="Arial" w:eastAsia="Arial" w:hAnsi="Arial"/>
+          <w:sz w:val="24"/>
+          <w:szCs w:val="24"/>
+          <w:rtl/>
+        </w:rPr>
+        <w:t xml:space="preserve">למה לא מוחקים מילים שחוזרות?</w:t>
+      </w:r>
+    </w:p>
+    <w:p>
+      <w:pPr>
+        <w:shd w:fill="FEF3C7" w:color="auto" w:val="clear"/>
+        <w:bidi/>
+        <w:spacing w:after="120" w:before="160"/>
+      </w:pPr>
+      <w:r>
+        <w:rPr>
+          <w:rFonts w:ascii="Arial" w:cs="Arial" w:eastAsia="Arial" w:hAnsi="Arial"/>
+          <w:b/>
+          <w:bCs/>
+          <w:color w:val="92400E"/>
+          <w:sz w:val="26"/>
+          <w:szCs w:val="26"/>
+          <w:rtl/>
+        </w:rPr>
+        <w:t xml:space="preserve">שורה שאתם לא יכולים להסביר לא תיחשב, גם אם היא עובדת.</w:t>
       </w:r>
     </w:p>
     <w:p>
@@ -3032,7 +4094,7 @@
           <w:szCs w:val="30"/>
           <w:rtl/>
         </w:rPr>
-        <w:t xml:space="preserve">להסביר כל שורה</w:t>
+        <w:t xml:space="preserve">לפני שמגישים</w:t>
       </w:r>
     </w:p>
     <w:p>
@@ -3047,7 +4109,26 @@
           <w:szCs w:val="24"/>
           <w:rtl/>
         </w:rPr>
-        <w:t xml:space="preserve">אחרי ההגשה תהיה שיחה קצרה, כ-3 דקות. המורה מצביע על שורות בקובץ שלכם, ולכל שורה עונים:</w:t>
+        <w:t xml:space="preserve">כל הפקודות רצות מתיקיית </w:t>
+      </w:r>
+      <w:r>
+        <w:rPr>
+          <w:rFonts w:ascii="Consolas" w:cs="Consolas" w:eastAsia="Consolas" w:hAnsi="Consolas"/>
+          <w:color w:val="0F766E"/>
+          <w:sz w:val="22"/>
+          <w:szCs w:val="22"/>
+          <w:rtl w:val="false"/>
+        </w:rPr>
+        <w:t xml:space="preserve">‎LLMClass‎</w:t>
+      </w:r>
+      <w:r>
+        <w:rPr>
+          <w:rFonts w:ascii="Arial" w:cs="Arial" w:eastAsia="Arial" w:hAnsi="Arial"/>
+          <w:sz w:val="24"/>
+          <w:szCs w:val="24"/>
+          <w:rtl/>
+        </w:rPr>
+        <w:t xml:space="preserve">.</w:t>
       </w:r>
     </w:p>
     <w:p>
@@ -3055,19 +4136,29 @@
         <w:pStyle w:val="ListParagraph"/>
         <w:numPr>
           <w:ilvl w:val="0"/>
-          <w:numId w:val="5"/>
+          <w:numId w:val="7"/>
         </w:numPr>
         <w:bidi/>
         <w:spacing w:after="80" w:line="300"/>
       </w:pPr>
       <w:r>
         <w:rPr>
-          <w:rFonts w:ascii="Arial" w:cs="Arial" w:eastAsia="Arial" w:hAnsi="Arial"/>
-          <w:sz w:val="24"/>
-          <w:szCs w:val="24"/>
-          <w:rtl/>
-        </w:rPr>
-        <w:t xml:space="preserve">מה השורה עושה?</w:t>
+          <w:rFonts w:ascii="Consolas" w:cs="Consolas" w:eastAsia="Consolas" w:hAnsi="Consolas"/>
+          <w:color w:val="0F766E"/>
+          <w:sz w:val="22"/>
+          <w:szCs w:val="22"/>
+          <w:rtl w:val="false"/>
+        </w:rPr>
+        <w:t xml:space="preserve">‎python -m tests.check_tokenizer‎</w:t>
+      </w:r>
+      <w:r>
+        <w:rPr>
+          <w:rFonts w:ascii="Arial" w:cs="Arial" w:eastAsia="Arial" w:hAnsi="Arial"/>
+          <w:sz w:val="24"/>
+          <w:szCs w:val="24"/>
+          <w:rtl/>
+        </w:rPr>
+        <w:t xml:space="preserve"> מסתיים ב-11 מתוך 11</w:t>
       </w:r>
     </w:p>
     <w:p>
@@ -3075,19 +4166,39 @@
         <w:pStyle w:val="ListParagraph"/>
         <w:numPr>
           <w:ilvl w:val="0"/>
-          <w:numId w:val="5"/>
+          <w:numId w:val="7"/>
         </w:numPr>
         <w:bidi/>
         <w:spacing w:after="80" w:line="300"/>
       </w:pPr>
       <w:r>
         <w:rPr>
-          <w:rFonts w:ascii="Arial" w:cs="Arial" w:eastAsia="Arial" w:hAnsi="Arial"/>
-          <w:sz w:val="24"/>
-          <w:szCs w:val="24"/>
-          <w:rtl/>
-        </w:rPr>
-        <w:t xml:space="preserve">מה יהיה במשתנה אחריה? תנו דוגמה על משפט קצר.</w:t>
+          <w:rFonts w:ascii="Consolas" w:cs="Consolas" w:eastAsia="Consolas" w:hAnsi="Consolas"/>
+          <w:color w:val="0F766E"/>
+          <w:sz w:val="22"/>
+          <w:szCs w:val="22"/>
+          <w:rtl w:val="false"/>
+        </w:rPr>
+        <w:t xml:space="preserve">‎python main.py‎</w:t>
+      </w:r>
+      <w:r>
+        <w:rPr>
+          <w:rFonts w:ascii="Arial" w:cs="Arial" w:eastAsia="Arial" w:hAnsi="Arial"/>
+          <w:sz w:val="24"/>
+          <w:szCs w:val="24"/>
+          <w:rtl/>
+        </w:rPr>
+        <w:t xml:space="preserve"> רץ בלי שגיאה ושומר את </w:t>
+      </w:r>
+      <w:r>
+        <w:rPr>
+          <w:rFonts w:ascii="Consolas" w:cs="Consolas" w:eastAsia="Consolas" w:hAnsi="Consolas"/>
+          <w:color w:val="0F766E"/>
+          <w:sz w:val="22"/>
+          <w:szCs w:val="22"/>
+          <w:rtl w:val="false"/>
+        </w:rPr>
+        <w:t xml:space="preserve">‎data/processed/clean_text.txt‎</w:t>
       </w:r>
     </w:p>
     <w:p>
@@ -3095,7 +4206,7 @@
         <w:pStyle w:val="ListParagraph"/>
         <w:numPr>
           <w:ilvl w:val="0"/>
-          <w:numId w:val="5"/>
+          <w:numId w:val="7"/>
         </w:numPr>
         <w:bidi/>
         <w:spacing w:after="80" w:line="300"/>
@@ -3107,22 +4218,45 @@
           <w:szCs w:val="24"/>
           <w:rtl/>
         </w:rPr>
-        <w:t xml:space="preserve">למה היא נמצאת דווקא במקום הזה?</w:t>
-      </w:r>
-    </w:p>
-    <w:p>
-      <w:pPr>
-        <w:bidi/>
-        <w:spacing w:after="80" w:before="120"/>
-      </w:pPr>
-      <w:r>
-        <w:rPr>
-          <w:rFonts w:ascii="Arial" w:cs="Arial" w:eastAsia="Arial" w:hAnsi="Arial"/>
-          <w:sz w:val="24"/>
-          <w:szCs w:val="24"/>
-          <w:rtl/>
-        </w:rPr>
-        <w:t xml:space="preserve">שאלות לדוגמה שכדאי להתכונן אליהן:</w:t>
+        <w:t xml:space="preserve">פתחתי את </w:t>
+      </w:r>
+      <w:r>
+        <w:rPr>
+          <w:rFonts w:ascii="Consolas" w:cs="Consolas" w:eastAsia="Consolas" w:hAnsi="Consolas"/>
+          <w:color w:val="0F766E"/>
+          <w:sz w:val="22"/>
+          <w:szCs w:val="22"/>
+          <w:rtl w:val="false"/>
+        </w:rPr>
+        <w:t xml:space="preserve">‎clean_text.txt‎</w:t>
+      </w:r>
+      <w:r>
+        <w:rPr>
+          <w:rFonts w:ascii="Arial" w:cs="Arial" w:eastAsia="Arial" w:hAnsi="Arial"/>
+          <w:sz w:val="24"/>
+          <w:szCs w:val="24"/>
+          <w:rtl/>
+        </w:rPr>
+        <w:t xml:space="preserve"> וראיתי שהטקסט נראה הגיוני, עם </w:t>
+      </w:r>
+      <w:r>
+        <w:rPr>
+          <w:rFonts w:ascii="Consolas" w:cs="Consolas" w:eastAsia="Consolas" w:hAnsi="Consolas"/>
+          <w:color w:val="0F766E"/>
+          <w:sz w:val="22"/>
+          <w:szCs w:val="22"/>
+          <w:rtl w:val="false"/>
+        </w:rPr>
+        <w:t xml:space="preserve">‎&lt;EOS&gt;‎</w:t>
+      </w:r>
+      <w:r>
+        <w:rPr>
+          <w:rFonts w:ascii="Arial" w:cs="Arial" w:eastAsia="Arial" w:hAnsi="Arial"/>
+          <w:sz w:val="24"/>
+          <w:szCs w:val="24"/>
+          <w:rtl/>
+        </w:rPr>
+        <w:t xml:space="preserve"> בסוף משפטים</w:t>
       </w:r>
     </w:p>
     <w:p>
@@ -3130,7 +4264,7 @@
         <w:pStyle w:val="ListParagraph"/>
         <w:numPr>
           <w:ilvl w:val="0"/>
-          <w:numId w:val="3"/>
+          <w:numId w:val="7"/>
         </w:numPr>
         <w:bidi/>
         <w:spacing w:after="80" w:line="300"/>
@@ -3142,26 +4276,7 @@
           <w:szCs w:val="24"/>
           <w:rtl/>
         </w:rPr>
-        <w:t xml:space="preserve">למה יש רווח לפני ואחרי </w:t>
-      </w:r>
-      <w:r>
-        <w:rPr>
-          <w:rFonts w:ascii="Consolas" w:cs="Consolas" w:eastAsia="Consolas" w:hAnsi="Consolas"/>
-          <w:color w:val="0F766E"/>
-          <w:sz w:val="22"/>
-          <w:szCs w:val="22"/>
-          <w:rtl w:val="false"/>
-        </w:rPr>
-        <w:t xml:space="preserve">‎&lt;EOS&gt;‎</w:t>
-      </w:r>
-      <w:r>
-        <w:rPr>
-          <w:rFonts w:ascii="Arial" w:cs="Arial" w:eastAsia="Arial" w:hAnsi="Arial"/>
-          <w:sz w:val="24"/>
-          <w:szCs w:val="24"/>
-          <w:rtl/>
-        </w:rPr>
-        <w:t xml:space="preserve">?</w:t>
+        <w:t xml:space="preserve">השם והכיתה שלי כתובים בראש הקובץ</w:t>
       </w:r>
     </w:p>
     <w:p>
@@ -3169,7 +4284,7 @@
         <w:pStyle w:val="ListParagraph"/>
         <w:numPr>
           <w:ilvl w:val="0"/>
-          <w:numId w:val="3"/>
+          <w:numId w:val="7"/>
         </w:numPr>
         <w:bidi/>
         <w:spacing w:after="80" w:line="300"/>
@@ -3181,7 +4296,36 @@
           <w:szCs w:val="24"/>
           <w:rtl/>
         </w:rPr>
-        <w:t xml:space="preserve">למה מקף הופך לרווח ולא נמחק?</w:t>
+        <w:t xml:space="preserve">יש הערה במילים שלי ליד כל שורה ב-</w:t>
+      </w:r>
+      <w:r>
+        <w:rPr>
+          <w:rFonts w:ascii="Consolas" w:cs="Consolas" w:eastAsia="Consolas" w:hAnsi="Consolas"/>
+          <w:color w:val="0F766E"/>
+          <w:sz w:val="22"/>
+          <w:szCs w:val="22"/>
+          <w:rtl w:val="false"/>
+        </w:rPr>
+        <w:t xml:space="preserve">‎clean‎</w:t>
+      </w:r>
+      <w:r>
+        <w:rPr>
+          <w:rFonts w:ascii="Arial" w:cs="Arial" w:eastAsia="Arial" w:hAnsi="Arial"/>
+          <w:sz w:val="24"/>
+          <w:szCs w:val="24"/>
+          <w:rtl/>
+        </w:rPr>
+        <w:t xml:space="preserve">, כולל ההערה על </w:t>
+      </w:r>
+      <w:r>
+        <w:rPr>
+          <w:rFonts w:ascii="Consolas" w:cs="Consolas" w:eastAsia="Consolas" w:hAnsi="Consolas"/>
+          <w:color w:val="0F766E"/>
+          <w:sz w:val="22"/>
+          <w:szCs w:val="22"/>
+          <w:rtl w:val="false"/>
+        </w:rPr>
+        <w:t xml:space="preserve">‎lower()‎</w:t>
       </w:r>
     </w:p>
     <w:p>
@@ -3189,647 +4333,7 @@
         <w:pStyle w:val="ListParagraph"/>
         <w:numPr>
           <w:ilvl w:val="0"/>
-          <w:numId w:val="3"/>
-        </w:numPr>
-        <w:bidi/>
-        <w:spacing w:after="80" w:line="300"/>
-      </w:pPr>
-      <w:r>
-        <w:rPr>
-          <w:rFonts w:ascii="Arial" w:cs="Arial" w:eastAsia="Arial" w:hAnsi="Arial"/>
-          <w:sz w:val="24"/>
-          <w:szCs w:val="24"/>
-          <w:rtl/>
-        </w:rPr>
-        <w:t xml:space="preserve">למה כותבים </w:t>
-      </w:r>
-      <w:r>
-        <w:rPr>
-          <w:rFonts w:ascii="Consolas" w:cs="Consolas" w:eastAsia="Consolas" w:hAnsi="Consolas"/>
-          <w:color w:val="0F766E"/>
-          <w:sz w:val="22"/>
-          <w:szCs w:val="22"/>
-          <w:rtl w:val="false"/>
-        </w:rPr>
-        <w:t xml:space="preserve">‎text = text.replace(...)‎</w:t>
-      </w:r>
-      <w:r>
-        <w:rPr>
-          <w:rFonts w:ascii="Arial" w:cs="Arial" w:eastAsia="Arial" w:hAnsi="Arial"/>
-          <w:sz w:val="24"/>
-          <w:szCs w:val="24"/>
-          <w:rtl/>
-        </w:rPr>
-        <w:t xml:space="preserve"> ולא רק </w:t>
-      </w:r>
-      <w:r>
-        <w:rPr>
-          <w:rFonts w:ascii="Consolas" w:cs="Consolas" w:eastAsia="Consolas" w:hAnsi="Consolas"/>
-          <w:color w:val="0F766E"/>
-          <w:sz w:val="22"/>
-          <w:szCs w:val="22"/>
-          <w:rtl w:val="false"/>
-        </w:rPr>
-        <w:t xml:space="preserve">‎text.replace(...)‎</w:t>
-      </w:r>
-      <w:r>
-        <w:rPr>
-          <w:rFonts w:ascii="Arial" w:cs="Arial" w:eastAsia="Arial" w:hAnsi="Arial"/>
-          <w:sz w:val="24"/>
-          <w:szCs w:val="24"/>
-          <w:rtl/>
-        </w:rPr>
-        <w:t xml:space="preserve">?</w:t>
-      </w:r>
-    </w:p>
-    <w:p>
-      <w:pPr>
-        <w:pStyle w:val="ListParagraph"/>
-        <w:numPr>
-          <w:ilvl w:val="0"/>
-          <w:numId w:val="3"/>
-        </w:numPr>
-        <w:bidi/>
-        <w:spacing w:after="80" w:line="300"/>
-      </w:pPr>
-      <w:r>
-        <w:rPr>
-          <w:rFonts w:ascii="Arial" w:cs="Arial" w:eastAsia="Arial" w:hAnsi="Arial"/>
-          <w:sz w:val="24"/>
-          <w:szCs w:val="24"/>
-          <w:rtl/>
-        </w:rPr>
-        <w:t xml:space="preserve">למה </w:t>
-      </w:r>
-      <w:r>
-        <w:rPr>
-          <w:rFonts w:ascii="Consolas" w:cs="Consolas" w:eastAsia="Consolas" w:hAnsi="Consolas"/>
-          <w:color w:val="0F766E"/>
-          <w:sz w:val="22"/>
-          <w:szCs w:val="22"/>
-          <w:rtl w:val="false"/>
-        </w:rPr>
-        <w:t xml:space="preserve">‎normalize_spaces‎</w:t>
-      </w:r>
-      <w:r>
-        <w:rPr>
-          <w:rFonts w:ascii="Arial" w:cs="Arial" w:eastAsia="Arial" w:hAnsi="Arial"/>
-          <w:sz w:val="24"/>
-          <w:szCs w:val="24"/>
-          <w:rtl/>
-        </w:rPr>
-        <w:t xml:space="preserve"> היא השלב האחרון ב-</w:t>
-      </w:r>
-      <w:r>
-        <w:rPr>
-          <w:rFonts w:ascii="Consolas" w:cs="Consolas" w:eastAsia="Consolas" w:hAnsi="Consolas"/>
-          <w:color w:val="0F766E"/>
-          <w:sz w:val="22"/>
-          <w:szCs w:val="22"/>
-          <w:rtl w:val="false"/>
-        </w:rPr>
-        <w:t xml:space="preserve">‎clean‎</w:t>
-      </w:r>
-      <w:r>
-        <w:rPr>
-          <w:rFonts w:ascii="Arial" w:cs="Arial" w:eastAsia="Arial" w:hAnsi="Arial"/>
-          <w:sz w:val="24"/>
-          <w:szCs w:val="24"/>
-          <w:rtl/>
-        </w:rPr>
-        <w:t xml:space="preserve">?</w:t>
-      </w:r>
-    </w:p>
-    <w:p>
-      <w:pPr>
-        <w:pStyle w:val="ListParagraph"/>
-        <w:numPr>
-          <w:ilvl w:val="0"/>
-          <w:numId w:val="3"/>
-        </w:numPr>
-        <w:bidi/>
-        <w:spacing w:after="80" w:line="300"/>
-      </w:pPr>
-      <w:r>
-        <w:rPr>
-          <w:rFonts w:ascii="Arial" w:cs="Arial" w:eastAsia="Arial" w:hAnsi="Arial"/>
-          <w:sz w:val="24"/>
-          <w:szCs w:val="24"/>
-          <w:rtl/>
-        </w:rPr>
-        <w:t xml:space="preserve">מה ההבדל בין </w:t>
-      </w:r>
-      <w:r>
-        <w:rPr>
-          <w:rFonts w:ascii="Consolas" w:cs="Consolas" w:eastAsia="Consolas" w:hAnsi="Consolas"/>
-          <w:color w:val="0F766E"/>
-          <w:sz w:val="22"/>
-          <w:szCs w:val="22"/>
-          <w:rtl w:val="false"/>
-        </w:rPr>
-        <w:t xml:space="preserve">‎split()‎</w:t>
-      </w:r>
-      <w:r>
-        <w:rPr>
-          <w:rFonts w:ascii="Arial" w:cs="Arial" w:eastAsia="Arial" w:hAnsi="Arial"/>
-          <w:sz w:val="24"/>
-          <w:szCs w:val="24"/>
-          <w:rtl/>
-        </w:rPr>
-        <w:t xml:space="preserve"> לבין </w:t>
-      </w:r>
-      <w:r>
-        <w:rPr>
-          <w:rFonts w:ascii="Consolas" w:cs="Consolas" w:eastAsia="Consolas" w:hAnsi="Consolas"/>
-          <w:color w:val="0F766E"/>
-          <w:sz w:val="22"/>
-          <w:szCs w:val="22"/>
-          <w:rtl w:val="false"/>
-        </w:rPr>
-        <w:t xml:space="preserve">‎split(" ")‎</w:t>
-      </w:r>
-      <w:r>
-        <w:rPr>
-          <w:rFonts w:ascii="Arial" w:cs="Arial" w:eastAsia="Arial" w:hAnsi="Arial"/>
-          <w:sz w:val="24"/>
-          <w:szCs w:val="24"/>
-          <w:rtl/>
-        </w:rPr>
-        <w:t xml:space="preserve">?</w:t>
-      </w:r>
-    </w:p>
-    <w:p>
-      <w:pPr>
-        <w:pStyle w:val="ListParagraph"/>
-        <w:numPr>
-          <w:ilvl w:val="0"/>
-          <w:numId w:val="3"/>
-        </w:numPr>
-        <w:bidi/>
-        <w:spacing w:after="80" w:line="300"/>
-      </w:pPr>
-      <w:r>
-        <w:rPr>
-          <w:rFonts w:ascii="Arial" w:cs="Arial" w:eastAsia="Arial" w:hAnsi="Arial"/>
-          <w:sz w:val="24"/>
-          <w:szCs w:val="24"/>
-          <w:rtl/>
-        </w:rPr>
-        <w:t xml:space="preserve">מה היה קורה באנגלית אם </w:t>
-      </w:r>
-      <w:r>
-        <w:rPr>
-          <w:rFonts w:ascii="Consolas" w:cs="Consolas" w:eastAsia="Consolas" w:hAnsi="Consolas"/>
-          <w:color w:val="0F766E"/>
-          <w:sz w:val="22"/>
-          <w:szCs w:val="22"/>
-          <w:rtl w:val="false"/>
-        </w:rPr>
-        <w:t xml:space="preserve">‎lower()‎</w:t>
-      </w:r>
-      <w:r>
-        <w:rPr>
-          <w:rFonts w:ascii="Arial" w:cs="Arial" w:eastAsia="Arial" w:hAnsi="Arial"/>
-          <w:sz w:val="24"/>
-          <w:szCs w:val="24"/>
-          <w:rtl/>
-        </w:rPr>
-        <w:t xml:space="preserve"> היה רץ אחרי </w:t>
-      </w:r>
-      <w:r>
-        <w:rPr>
-          <w:rFonts w:ascii="Consolas" w:cs="Consolas" w:eastAsia="Consolas" w:hAnsi="Consolas"/>
-          <w:color w:val="0F766E"/>
-          <w:sz w:val="22"/>
-          <w:szCs w:val="22"/>
-          <w:rtl w:val="false"/>
-        </w:rPr>
-        <w:t xml:space="preserve">‎mark_sentences‎</w:t>
-      </w:r>
-      <w:r>
-        <w:rPr>
-          <w:rFonts w:ascii="Arial" w:cs="Arial" w:eastAsia="Arial" w:hAnsi="Arial"/>
-          <w:sz w:val="24"/>
-          <w:szCs w:val="24"/>
-          <w:rtl/>
-        </w:rPr>
-        <w:t xml:space="preserve">?</w:t>
-      </w:r>
-    </w:p>
-    <w:p>
-      <w:pPr>
-        <w:pStyle w:val="ListParagraph"/>
-        <w:numPr>
-          <w:ilvl w:val="0"/>
-          <w:numId w:val="3"/>
-        </w:numPr>
-        <w:bidi/>
-        <w:spacing w:after="80" w:line="300"/>
-      </w:pPr>
-      <w:r>
-        <w:rPr>
-          <w:rFonts w:ascii="Arial" w:cs="Arial" w:eastAsia="Arial" w:hAnsi="Arial"/>
-          <w:sz w:val="24"/>
-          <w:szCs w:val="24"/>
-          <w:rtl/>
-        </w:rPr>
-        <w:t xml:space="preserve">מה </w:t>
-      </w:r>
-      <w:r>
-        <w:rPr>
-          <w:rFonts w:ascii="Consolas" w:cs="Consolas" w:eastAsia="Consolas" w:hAnsi="Consolas"/>
-          <w:color w:val="0F766E"/>
-          <w:sz w:val="22"/>
-          <w:szCs w:val="22"/>
-          <w:rtl w:val="false"/>
-        </w:rPr>
-        <w:t xml:space="preserve">‎encoding="utf-8"‎</w:t>
-      </w:r>
-      <w:r>
-        <w:rPr>
-          <w:rFonts w:ascii="Arial" w:cs="Arial" w:eastAsia="Arial" w:hAnsi="Arial"/>
-          <w:sz w:val="24"/>
-          <w:szCs w:val="24"/>
-          <w:rtl/>
-        </w:rPr>
-        <w:t xml:space="preserve"> עושה, ומה קורה בלעדיו?</w:t>
-      </w:r>
-    </w:p>
-    <w:p>
-      <w:pPr>
-        <w:pStyle w:val="ListParagraph"/>
-        <w:numPr>
-          <w:ilvl w:val="0"/>
-          <w:numId w:val="3"/>
-        </w:numPr>
-        <w:bidi/>
-        <w:spacing w:after="80" w:line="300"/>
-      </w:pPr>
-      <w:r>
-        <w:rPr>
-          <w:rFonts w:ascii="Arial" w:cs="Arial" w:eastAsia="Arial" w:hAnsi="Arial"/>
-          <w:sz w:val="24"/>
-          <w:szCs w:val="24"/>
-          <w:rtl/>
-        </w:rPr>
-        <w:t xml:space="preserve">מה עושה </w:t>
-      </w:r>
-      <w:r>
-        <w:rPr>
-          <w:rFonts w:ascii="Consolas" w:cs="Consolas" w:eastAsia="Consolas" w:hAnsi="Consolas"/>
-          <w:color w:val="0F766E"/>
-          <w:sz w:val="22"/>
-          <w:szCs w:val="22"/>
-          <w:rtl w:val="false"/>
-        </w:rPr>
-        <w:t xml:space="preserve">‎with‎</w:t>
-      </w:r>
-      <w:r>
-        <w:rPr>
-          <w:rFonts w:ascii="Arial" w:cs="Arial" w:eastAsia="Arial" w:hAnsi="Arial"/>
-          <w:sz w:val="24"/>
-          <w:szCs w:val="24"/>
-          <w:rtl/>
-        </w:rPr>
-        <w:t xml:space="preserve">, ומה ההבדל בין </w:t>
-      </w:r>
-      <w:r>
-        <w:rPr>
-          <w:rFonts w:ascii="Consolas" w:cs="Consolas" w:eastAsia="Consolas" w:hAnsi="Consolas"/>
-          <w:color w:val="0F766E"/>
-          <w:sz w:val="22"/>
-          <w:szCs w:val="22"/>
-          <w:rtl w:val="false"/>
-        </w:rPr>
-        <w:t xml:space="preserve">‎"r"‎</w:t>
-      </w:r>
-      <w:r>
-        <w:rPr>
-          <w:rFonts w:ascii="Arial" w:cs="Arial" w:eastAsia="Arial" w:hAnsi="Arial"/>
-          <w:sz w:val="24"/>
-          <w:szCs w:val="24"/>
-          <w:rtl/>
-        </w:rPr>
-        <w:t xml:space="preserve"> ל-</w:t>
-      </w:r>
-      <w:r>
-        <w:rPr>
-          <w:rFonts w:ascii="Consolas" w:cs="Consolas" w:eastAsia="Consolas" w:hAnsi="Consolas"/>
-          <w:color w:val="0F766E"/>
-          <w:sz w:val="22"/>
-          <w:szCs w:val="22"/>
-          <w:rtl w:val="false"/>
-        </w:rPr>
-        <w:t xml:space="preserve">‎"w"‎</w:t>
-      </w:r>
-      <w:r>
-        <w:rPr>
-          <w:rFonts w:ascii="Arial" w:cs="Arial" w:eastAsia="Arial" w:hAnsi="Arial"/>
-          <w:sz w:val="24"/>
-          <w:szCs w:val="24"/>
-          <w:rtl/>
-        </w:rPr>
-        <w:t xml:space="preserve">?</w:t>
-      </w:r>
-    </w:p>
-    <w:p>
-      <w:pPr>
-        <w:pStyle w:val="ListParagraph"/>
-        <w:numPr>
-          <w:ilvl w:val="0"/>
-          <w:numId w:val="3"/>
-        </w:numPr>
-        <w:bidi/>
-        <w:spacing w:after="80" w:line="300"/>
-      </w:pPr>
-      <w:r>
-        <w:rPr>
-          <w:rFonts w:ascii="Arial" w:cs="Arial" w:eastAsia="Arial" w:hAnsi="Arial"/>
-          <w:sz w:val="24"/>
-          <w:szCs w:val="24"/>
-          <w:rtl/>
-        </w:rPr>
-        <w:t xml:space="preserve">למה לא מוחקים מילים שחוזרות?</w:t>
-      </w:r>
-    </w:p>
-    <w:p>
-      <w:pPr>
-        <w:shd w:fill="FEF3C7" w:color="auto" w:val="clear"/>
-        <w:bidi/>
-        <w:spacing w:after="120" w:before="160"/>
-      </w:pPr>
-      <w:r>
-        <w:rPr>
-          <w:rFonts w:ascii="Arial" w:cs="Arial" w:eastAsia="Arial" w:hAnsi="Arial"/>
-          <w:b/>
-          <w:bCs/>
-          <w:color w:val="92400E"/>
-          <w:sz w:val="26"/>
-          <w:szCs w:val="26"/>
-          <w:rtl/>
-        </w:rPr>
-        <w:t xml:space="preserve">שורה שאתם לא יכולים להסביר לא תיחשב, גם אם היא עובדת.</w:t>
-      </w:r>
-    </w:p>
-    <w:p>
-      <w:pPr>
-        <w:pStyle w:val="Heading1"/>
-        <w:pBdr>
-          <w:bottom w:val="single" w:color="D9DED8" w:sz="6" w:space="4"/>
-        </w:pBdr>
-        <w:bidi/>
-        <w:spacing w:after="120" w:before="320"/>
-      </w:pPr>
-      <w:r>
-        <w:rPr>
-          <w:rFonts w:ascii="Arial" w:cs="Arial" w:eastAsia="Arial" w:hAnsi="Arial"/>
-          <w:b/>
-          <w:bCs/>
-          <w:color w:val="0F766E"/>
-          <w:sz w:val="30"/>
-          <w:szCs w:val="30"/>
-          <w:rtl/>
-        </w:rPr>
-        <w:t xml:space="preserve">לפני שמגישים</w:t>
-      </w:r>
-    </w:p>
-    <w:p>
-      <w:pPr>
-        <w:bidi/>
-        <w:spacing w:after="120" w:line="300"/>
-      </w:pPr>
-      <w:r>
-        <w:rPr>
-          <w:rFonts w:ascii="Arial" w:cs="Arial" w:eastAsia="Arial" w:hAnsi="Arial"/>
-          <w:sz w:val="24"/>
-          <w:szCs w:val="24"/>
-          <w:rtl/>
-        </w:rPr>
-        <w:t xml:space="preserve">כל הפקודות רצות מתיקיית </w:t>
-      </w:r>
-      <w:r>
-        <w:rPr>
-          <w:rFonts w:ascii="Consolas" w:cs="Consolas" w:eastAsia="Consolas" w:hAnsi="Consolas"/>
-          <w:color w:val="0F766E"/>
-          <w:sz w:val="22"/>
-          <w:szCs w:val="22"/>
-          <w:rtl w:val="false"/>
-        </w:rPr>
-        <w:t xml:space="preserve">‎LLMClass‎</w:t>
-      </w:r>
-      <w:r>
-        <w:rPr>
-          <w:rFonts w:ascii="Arial" w:cs="Arial" w:eastAsia="Arial" w:hAnsi="Arial"/>
-          <w:sz w:val="24"/>
-          <w:szCs w:val="24"/>
-          <w:rtl/>
-        </w:rPr>
-        <w:t xml:space="preserve">.</w:t>
-      </w:r>
-    </w:p>
-    <w:p>
-      <w:pPr>
-        <w:pStyle w:val="ListParagraph"/>
-        <w:numPr>
-          <w:ilvl w:val="0"/>
-          <w:numId w:val="6"/>
-        </w:numPr>
-        <w:bidi/>
-        <w:spacing w:after="80" w:line="300"/>
-      </w:pPr>
-      <w:r>
-        <w:rPr>
-          <w:rFonts w:ascii="Consolas" w:cs="Consolas" w:eastAsia="Consolas" w:hAnsi="Consolas"/>
-          <w:color w:val="0F766E"/>
-          <w:sz w:val="22"/>
-          <w:szCs w:val="22"/>
-          <w:rtl w:val="false"/>
-        </w:rPr>
-        <w:t xml:space="preserve">‎python -m tests.check_tokenizer‎</w:t>
-      </w:r>
-      <w:r>
-        <w:rPr>
-          <w:rFonts w:ascii="Arial" w:cs="Arial" w:eastAsia="Arial" w:hAnsi="Arial"/>
-          <w:sz w:val="24"/>
-          <w:szCs w:val="24"/>
-          <w:rtl/>
-        </w:rPr>
-        <w:t xml:space="preserve"> מסתיים ב-11 מתוך 11</w:t>
-      </w:r>
-    </w:p>
-    <w:p>
-      <w:pPr>
-        <w:pStyle w:val="ListParagraph"/>
-        <w:numPr>
-          <w:ilvl w:val="0"/>
-          <w:numId w:val="6"/>
-        </w:numPr>
-        <w:bidi/>
-        <w:spacing w:after="80" w:line="300"/>
-      </w:pPr>
-      <w:r>
-        <w:rPr>
-          <w:rFonts w:ascii="Consolas" w:cs="Consolas" w:eastAsia="Consolas" w:hAnsi="Consolas"/>
-          <w:color w:val="0F766E"/>
-          <w:sz w:val="22"/>
-          <w:szCs w:val="22"/>
-          <w:rtl w:val="false"/>
-        </w:rPr>
-        <w:t xml:space="preserve">‎python main.py‎</w:t>
-      </w:r>
-      <w:r>
-        <w:rPr>
-          <w:rFonts w:ascii="Arial" w:cs="Arial" w:eastAsia="Arial" w:hAnsi="Arial"/>
-          <w:sz w:val="24"/>
-          <w:szCs w:val="24"/>
-          <w:rtl/>
-        </w:rPr>
-        <w:t xml:space="preserve"> רץ בלי שגיאה ושומר את </w:t>
-      </w:r>
-      <w:r>
-        <w:rPr>
-          <w:rFonts w:ascii="Consolas" w:cs="Consolas" w:eastAsia="Consolas" w:hAnsi="Consolas"/>
-          <w:color w:val="0F766E"/>
-          <w:sz w:val="22"/>
-          <w:szCs w:val="22"/>
-          <w:rtl w:val="false"/>
-        </w:rPr>
-        <w:t xml:space="preserve">‎data/processed/clean_text.txt‎</w:t>
-      </w:r>
-    </w:p>
-    <w:p>
-      <w:pPr>
-        <w:pStyle w:val="ListParagraph"/>
-        <w:numPr>
-          <w:ilvl w:val="0"/>
-          <w:numId w:val="6"/>
-        </w:numPr>
-        <w:bidi/>
-        <w:spacing w:after="80" w:line="300"/>
-      </w:pPr>
-      <w:r>
-        <w:rPr>
-          <w:rFonts w:ascii="Arial" w:cs="Arial" w:eastAsia="Arial" w:hAnsi="Arial"/>
-          <w:sz w:val="24"/>
-          <w:szCs w:val="24"/>
-          <w:rtl/>
-        </w:rPr>
-        <w:t xml:space="preserve">פתחתי את </w:t>
-      </w:r>
-      <w:r>
-        <w:rPr>
-          <w:rFonts w:ascii="Consolas" w:cs="Consolas" w:eastAsia="Consolas" w:hAnsi="Consolas"/>
-          <w:color w:val="0F766E"/>
-          <w:sz w:val="22"/>
-          <w:szCs w:val="22"/>
-          <w:rtl w:val="false"/>
-        </w:rPr>
-        <w:t xml:space="preserve">‎clean_text.txt‎</w:t>
-      </w:r>
-      <w:r>
-        <w:rPr>
-          <w:rFonts w:ascii="Arial" w:cs="Arial" w:eastAsia="Arial" w:hAnsi="Arial"/>
-          <w:sz w:val="24"/>
-          <w:szCs w:val="24"/>
-          <w:rtl/>
-        </w:rPr>
-        <w:t xml:space="preserve"> וראיתי שהטקסט נראה הגיוני, עם </w:t>
-      </w:r>
-      <w:r>
-        <w:rPr>
-          <w:rFonts w:ascii="Consolas" w:cs="Consolas" w:eastAsia="Consolas" w:hAnsi="Consolas"/>
-          <w:color w:val="0F766E"/>
-          <w:sz w:val="22"/>
-          <w:szCs w:val="22"/>
-          <w:rtl w:val="false"/>
-        </w:rPr>
-        <w:t xml:space="preserve">‎&lt;EOS&gt;‎</w:t>
-      </w:r>
-      <w:r>
-        <w:rPr>
-          <w:rFonts w:ascii="Arial" w:cs="Arial" w:eastAsia="Arial" w:hAnsi="Arial"/>
-          <w:sz w:val="24"/>
-          <w:szCs w:val="24"/>
-          <w:rtl/>
-        </w:rPr>
-        <w:t xml:space="preserve"> בסוף משפטים</w:t>
-      </w:r>
-    </w:p>
-    <w:p>
-      <w:pPr>
-        <w:pStyle w:val="ListParagraph"/>
-        <w:numPr>
-          <w:ilvl w:val="0"/>
-          <w:numId w:val="6"/>
-        </w:numPr>
-        <w:bidi/>
-        <w:spacing w:after="80" w:line="300"/>
-      </w:pPr>
-      <w:r>
-        <w:rPr>
-          <w:rFonts w:ascii="Arial" w:cs="Arial" w:eastAsia="Arial" w:hAnsi="Arial"/>
-          <w:sz w:val="24"/>
-          <w:szCs w:val="24"/>
-          <w:rtl/>
-        </w:rPr>
-        <w:t xml:space="preserve">השם והכיתה שלי כתובים בראש הקובץ</w:t>
-      </w:r>
-    </w:p>
-    <w:p>
-      <w:pPr>
-        <w:pStyle w:val="ListParagraph"/>
-        <w:numPr>
-          <w:ilvl w:val="0"/>
-          <w:numId w:val="6"/>
-        </w:numPr>
-        <w:bidi/>
-        <w:spacing w:after="80" w:line="300"/>
-      </w:pPr>
-      <w:r>
-        <w:rPr>
-          <w:rFonts w:ascii="Arial" w:cs="Arial" w:eastAsia="Arial" w:hAnsi="Arial"/>
-          <w:sz w:val="24"/>
-          <w:szCs w:val="24"/>
-          <w:rtl/>
-        </w:rPr>
-        <w:t xml:space="preserve">יש הערה במילים שלי ליד כל שורה ב-</w:t>
-      </w:r>
-      <w:r>
-        <w:rPr>
-          <w:rFonts w:ascii="Consolas" w:cs="Consolas" w:eastAsia="Consolas" w:hAnsi="Consolas"/>
-          <w:color w:val="0F766E"/>
-          <w:sz w:val="22"/>
-          <w:szCs w:val="22"/>
-          <w:rtl w:val="false"/>
-        </w:rPr>
-        <w:t xml:space="preserve">‎clean‎</w:t>
-      </w:r>
-      <w:r>
-        <w:rPr>
-          <w:rFonts w:ascii="Arial" w:cs="Arial" w:eastAsia="Arial" w:hAnsi="Arial"/>
-          <w:sz w:val="24"/>
-          <w:szCs w:val="24"/>
-          <w:rtl/>
-        </w:rPr>
-        <w:t xml:space="preserve">, כולל ההערה על </w:t>
-      </w:r>
-      <w:r>
-        <w:rPr>
-          <w:rFonts w:ascii="Consolas" w:cs="Consolas" w:eastAsia="Consolas" w:hAnsi="Consolas"/>
-          <w:color w:val="0F766E"/>
-          <w:sz w:val="22"/>
-          <w:szCs w:val="22"/>
-          <w:rtl w:val="false"/>
-        </w:rPr>
-        <w:t xml:space="preserve">‎lower()‎</w:t>
-      </w:r>
-    </w:p>
-    <w:p>
-      <w:pPr>
-        <w:pStyle w:val="ListParagraph"/>
-        <w:numPr>
-          <w:ilvl w:val="0"/>
-          <w:numId w:val="6"/>
+          <w:numId w:val="7"/>
         </w:numPr>
         <w:bidi/>
         <w:spacing w:after="80" w:line="300"/>
@@ -4481,6 +4985,18 @@
     <w:multiLevelType w:val="hybridMultilevel"/>
     <w:lvl w:ilvl="0" w15:tentative="1">
       <w:start w:val="1"/>
+      <w:numFmt w:val="decimal"/>
+      <w:lvlText w:val="%1."/>
+      <w:lvlJc w:val="left"/>
+      <w:pPr>
+        <w:ind w:left="540" w:hanging="360"/>
+      </w:pPr>
+    </w:lvl>
+  </w:abstractNum>
+  <w:abstractNum w:abstractNumId="7" w15:restartNumberingAfterBreak="0">
+    <w:multiLevelType w:val="hybridMultilevel"/>
+    <w:lvl w:ilvl="0" w15:tentative="1">
+      <w:start w:val="1"/>
       <w:numFmt w:val="bullet"/>
       <w:lvlText w:val="☐"/>
       <w:lvlJc w:val="left"/>
@@ -4502,25 +5018,31 @@
     </w:lvlOverride>
   </w:num>
   <w:num w:numId="3">
+    <w:abstractNumId w:val="6"/>
+    <w:lvlOverride w:ilvl="0">
+      <w:startOverride w:val="1"/>
+    </w:lvlOverride>
+  </w:num>
+  <w:num w:numId="4">
     <w:abstractNumId w:val="2"/>
     <w:lvlOverride w:ilvl="0">
       <w:startOverride w:val="1"/>
     </w:lvlOverride>
   </w:num>
-  <w:num w:numId="4">
+  <w:num w:numId="5">
     <w:abstractNumId w:val="3"/>
     <w:lvlOverride w:ilvl="0">
       <w:startOverride w:val="1"/>
     </w:lvlOverride>
   </w:num>
-  <w:num w:numId="5">
+  <w:num w:numId="6">
     <w:abstractNumId w:val="4"/>
     <w:lvlOverride w:ilvl="0">
       <w:startOverride w:val="1"/>
     </w:lvlOverride>
   </w:num>
-  <w:num w:numId="6">
-    <w:abstractNumId w:val="6"/>
+  <w:num w:numId="7">
+    <w:abstractNumId w:val="7"/>
     <w:lvlOverride w:ilvl="0">
       <w:startOverride w:val="1"/>
     </w:lvlOverride>

</xml_diff>

<commit_message>
Split main.py into independent per-step scripts; templates return typed stubs
main_tokenizer.py runs step 1; main_ngrams.py reads ready-made tokens from
data/raw/sample_tokens.txt so it works before the tokenizer is done.
Template functions return an empty value of the right type instead of None,
so nothing crashes; tests were tightened so the stubs still score 0.

Co-Authored-By: Claude Opus 5.5 <noreply@anthropic.com>
Claude-Session: https://claude.ai/code/session_01QcwKjrvcPULEZZ9Qz4n5Vo
</commit_message>
<xml_diff>
--- a/ASSIGNMENT.docx
+++ b/ASSIGNMENT.docx
@@ -348,7 +348,7 @@
           <w:szCs w:val="22"/>
           <w:rtl w:val="false"/>
         </w:rPr>
-        <w:t xml:space="preserve">‎main.py‎</w:t>
+        <w:t xml:space="preserve">‎main_tokenizer.py‎</w:t>
       </w:r>
       <w:r>
         <w:rPr>
@@ -398,7 +398,7 @@
           <w:szCs w:val="22"/>
           <w:rtl w:val="false"/>
         </w:rPr>
-        <w:t xml:space="preserve">‎main.py‎</w:t>
+        <w:t xml:space="preserve">‎main_tokenizer.py‎</w:t>
       </w:r>
       <w:r>
         <w:rPr>
@@ -474,7 +474,7 @@
           <w:szCs w:val="22"/>
           <w:rtl w:val="false"/>
         </w:rPr>
-        <w:t xml:space="preserve">‎main.py‎</w:t>
+        <w:t xml:space="preserve">‎main_tokenizer.py‎</w:t>
       </w:r>
       <w:r>
         <w:rPr>
@@ -563,7 +563,7 @@
           <w:szCs w:val="22"/>
           <w:rtl w:val="false"/>
         </w:rPr>
-        <w:t xml:space="preserve">‎main.py‎</w:t>
+        <w:t xml:space="preserve">‎main_tokenizer.py‎</w:t>
       </w:r>
       <w:r>
         <w:rPr>
@@ -783,35 +783,16 @@
           <w:szCs w:val="22"/>
           <w:rtl w:val="false"/>
         </w:rPr>
-        <w:t xml:space="preserve">‎main.py‎</w:t>
-      </w:r>
-      <w:r>
-        <w:rPr>
-          <w:rFonts w:ascii="Arial" w:cs="Arial" w:eastAsia="Arial" w:hAnsi="Arial"/>
-          <w:sz w:val="24"/>
-          <w:szCs w:val="24"/>
-          <w:rtl/>
-        </w:rPr>
-        <w:t xml:space="preserve"> ייעצר בשלד הריק עם </w:t>
-      </w:r>
-      <w:r>
-        <w:rPr>
-          <w:rFonts w:ascii="Consolas" w:cs="Consolas" w:eastAsia="Consolas" w:hAnsi="Consolas"/>
-          <w:color w:val="0F766E"/>
-          <w:sz w:val="22"/>
-          <w:szCs w:val="22"/>
-          <w:rtl w:val="false"/>
-        </w:rPr>
-        <w:t xml:space="preserve">‎TypeError‎</w:t>
-      </w:r>
-      <w:r>
-        <w:rPr>
-          <w:rFonts w:ascii="Arial" w:cs="Arial" w:eastAsia="Arial" w:hAnsi="Arial"/>
-          <w:sz w:val="24"/>
-          <w:szCs w:val="24"/>
-          <w:rtl/>
-        </w:rPr>
-        <w:t xml:space="preserve">, כי הפונקציות עוד לא מחזירות כלום. זה יסתדר כשתממשו אותן.</w:t>
+        <w:t xml:space="preserve">‎main_tokenizer.py‎</w:t>
+      </w:r>
+      <w:r>
+        <w:rPr>
+          <w:rFonts w:ascii="Arial" w:cs="Arial" w:eastAsia="Arial" w:hAnsi="Arial"/>
+          <w:sz w:val="24"/>
+          <w:szCs w:val="24"/>
+          <w:rtl/>
+        </w:rPr>
+        <w:t xml:space="preserve"> ירוץ בשלד הריק, אבל ידפיס רשימה ריקה והודעה שהפונקציות עוד לא מומשו. זה יסתדר כשתממשו אותן.</w:t>
       </w:r>
     </w:p>
     <w:p>
@@ -4179,7 +4160,7 @@
           <w:szCs w:val="22"/>
           <w:rtl w:val="false"/>
         </w:rPr>
-        <w:t xml:space="preserve">‎python main.py‎</w:t>
+        <w:t xml:space="preserve">‎python main_tokenizer.py‎</w:t>
       </w:r>
       <w:r>
         <w:rPr>

</xml_diff>

<commit_message>
Drop name and class requirement from submission instructions
Co-Authored-By: Claude Opus 5.5 <noreply@anthropic.com>
Claude-Session: https://claude.ai/code/session_01QcwKjrvcPULEZZ9Qz4n5Vo
</commit_message>
<xml_diff>
--- a/ASSIGNMENT.docx
+++ b/ASSIGNMENT.docx
@@ -1395,37 +1395,6 @@
           <w:rtl w:val="false"/>
         </w:rPr>
         <w:t xml:space="preserve">‎llmclass/tokenizer.py‎</w:t>
-      </w:r>
-    </w:p>
-    <w:p>
-      <w:pPr>
-        <w:pStyle w:val="ListParagraph"/>
-        <w:numPr>
-          <w:ilvl w:val="0"/>
-          <w:numId w:val="4"/>
-        </w:numPr>
-        <w:bidi/>
-        <w:spacing w:after="80" w:line="300"/>
-      </w:pPr>
-      <w:r>
-        <w:rPr>
-          <w:rFonts w:ascii="Arial" w:cs="Arial" w:eastAsia="Arial" w:hAnsi="Arial"/>
-          <w:b/>
-          <w:bCs/>
-          <w:sz w:val="24"/>
-          <w:szCs w:val="24"/>
-          <w:rtl/>
-        </w:rPr>
-        <w:t xml:space="preserve">בראש הקובץ:</w:t>
-      </w:r>
-      <w:r>
-        <w:rPr>
-          <w:rFonts w:ascii="Arial" w:cs="Arial" w:eastAsia="Arial" w:hAnsi="Arial"/>
-          <w:sz w:val="24"/>
-          <w:szCs w:val="24"/>
-          <w:rtl/>
-        </w:rPr>
-        <w:t xml:space="preserve"> שם מלא וכיתה, בשורות שכבר מחכות לכם שם</w:t>
       </w:r>
     </w:p>
     <w:p>
@@ -4238,26 +4207,6 @@
           <w:rtl/>
         </w:rPr>
         <w:t xml:space="preserve"> בסוף משפטים</w:t>
-      </w:r>
-    </w:p>
-    <w:p>
-      <w:pPr>
-        <w:pStyle w:val="ListParagraph"/>
-        <w:numPr>
-          <w:ilvl w:val="0"/>
-          <w:numId w:val="7"/>
-        </w:numPr>
-        <w:bidi/>
-        <w:spacing w:after="80" w:line="300"/>
-      </w:pPr>
-      <w:r>
-        <w:rPr>
-          <w:rFonts w:ascii="Arial" w:cs="Arial" w:eastAsia="Arial" w:hAnsi="Arial"/>
-          <w:sz w:val="24"/>
-          <w:szCs w:val="24"/>
-          <w:rtl/>
-        </w:rPr>
-        <w:t xml:space="preserve">השם והכיתה שלי כתובים בראש הקובץ</w:t>
       </w:r>
     </w:p>
     <w:p>

</xml_diff>